<commit_message>
Add full-load Redis telemetry and private metrics routing
</commit_message>
<xml_diff>
--- a/docs/redis-load-testing-report-2026-07-23.docx
+++ b/docs/redis-load-testing-report-2026-07-23.docx
@@ -85,7 +85,7 @@
                 <w:color w:val="24313B"/>
                 <w:sz w:val="20"/>
               </w:rPr>
-              <w:t>Atomic writes, immediately-current reads, cluster-aware routing, 12 query patterns, a 244.2 million-document seed, the retained 2 TB-class full-load environment, the optimized gzip staircase, the valid 180K-read/sec + 30K-write/sec stress run, and the complete experiment history.</w:t>
+              <w:t>Atomic writes, immediately-current reads, cluster-aware routing, 12 query patterns, a 244.2 million-document seed, the retained 2 TB-class environment, the optimized gzip staircase, the latest instrumented 180K-read/sec + 30K-write/sec stress run, and post-run Redis Cloud private-metrics validation.</w:t>
             </w:r>
           </w:p>
         </w:tc>
@@ -112,7 +112,7 @@
           <w:color w:val="61717D"/>
           <w:sz w:val="19"/>
         </w:rPr>
-        <w:t>Latest sequence: optimized clean-capacity validation followed by a valid 180K-read/sec + 30K-write/sec full-load stress run</w:t>
+        <w:t>Latest sequence: instrumented 180K-read/sec + 30K-write/sec full-load stress on 128 API workers, followed by Redis Cloud private-metrics validation</w:t>
       </w:r>
     </w:p>
     <w:p>
@@ -583,7 +583,7 @@
                 <w:color w:val="61717D"/>
                 <w:sz w:val="18"/>
               </w:rPr>
-              <w:t>26</w:t>
+              <w:t>27</w:t>
             </w:r>
           </w:p>
         </w:tc>
@@ -636,7 +636,7 @@
                 <w:color w:val="2A7F9E"/>
                 <w:sz w:val="22"/>
               </w:rPr>
-              <w:t>29</w:t>
+              <w:t>30</w:t>
             </w:r>
           </w:p>
         </w:tc>
@@ -701,7 +701,7 @@
                 <w:color w:val="24313B"/>
                 <w:sz w:val="18"/>
               </w:rPr>
-              <w:t>The clean optimized staircase remains the capacity baseline: 2,556 reads/sec meets the strict SLO and 3,400 reads/sec meets rate but misses three p95 objectives. The newest 180K-read/sec run is an overload characterization: it produced more successful reads, but also heavy admission rejection, generator drops, and timeouts.</w:t>
+              <w:t>The clean optimized staircase remains the capacity baseline: 2,556 reads/sec meets the strict SLO and 3,400 reads/sec meets rate but misses three p95 objectives. The latest 180K-read/sec run is an overload characterization: 11,767.22 reads/sec succeeded, but admission rejection, generator drops, and timeouts remained dominant.</w:t>
             </w:r>
           </w:p>
         </w:tc>
@@ -739,7 +739,7 @@
           <w:color w:val="61717D"/>
           <w:sz w:val="20"/>
         </w:rPr>
-        <w:t>The optimized sequence sustains 2,556 reads/sec within the strict latency SLO and 3,400 reads/sec at the throughput objective while preserving 30K atomic writes/sec. The subsequent valid full-load stress run achieved 10,136.75 successful reads/sec of 180,000 and 29,847.15 writes/sec of 30,000.</w:t>
+        <w:t>The optimized sequence sustains 2,556 reads/sec within the strict latency SLO and 3,400 reads/sec at the throughput objective while preserving 30K atomic writes/sec. The latest instrumented full-load stress run achieved 11,767.22 successful reads/sec of 180,000 and 29,001.74 writes/sec of 30,000.</w:t>
       </w:r>
     </w:p>
     <w:tbl>
@@ -869,7 +869,7 @@
                 <w:color w:val="1C8A77"/>
                 <w:sz w:val="36"/>
               </w:rPr>
-              <w:t>10,136.75/s</w:t>
+              <w:t>11,767.22/s</w:t>
             </w:r>
           </w:p>
           <w:p>
@@ -880,10 +880,11 @@
             <w:r>
               <w:rPr>
                 <w:rFonts w:ascii="Arial" w:hAnsi="Arial" w:eastAsia="Arial"/>
+                <w:b w:val="0"/>
                 <w:color w:val="61717D"/>
                 <w:sz w:val="17"/>
               </w:rPr>
-              <w:t>full-load successful reads</w:t>
+              <w:t>latest full-load reads</w:t>
             </w:r>
           </w:p>
         </w:tc>
@@ -910,7 +911,7 @@
                 <w:color w:val="B5473C"/>
                 <w:sz w:val="36"/>
               </w:rPr>
-              <w:t>29,847.15/s</w:t>
+              <w:t>29,001.74/s</w:t>
             </w:r>
           </w:p>
           <w:p>
@@ -921,10 +922,11 @@
             <w:r>
               <w:rPr>
                 <w:rFonts w:ascii="Arial" w:hAnsi="Arial" w:eastAsia="Arial"/>
+                <w:b w:val="0"/>
                 <w:color w:val="61717D"/>
                 <w:sz w:val="17"/>
               </w:rPr>
-              <w:t>full-load writes</w:t>
+              <w:t>latest full-load writes</w:t>
             </w:r>
           </w:p>
         </w:tc>
@@ -1013,7 +1015,7 @@
                 <w:color w:val="24313B"/>
                 <w:sz w:val="18"/>
               </w:rPr>
-              <w:t>Use 2,556 mixed reads/sec plus 30,000 writes/sec as the strict-SLO capacity of the tested topology. The newest full-load stress run achieved 10,136.75 successful reads/sec of 180,000 and 29,847.15 writes/sec of 30,000, but its 7.54 million HTTP 429 responses, 2.30 million scheduler drops, and 345,915 timeouts make it an overload result—not a new clean capacity claim.</w:t>
+              <w:t>Use 2,556 mixed reads/sec plus 30,000 writes/sec as the strict-SLO capacity of the tested topology. The latest full-load stress achieved 11,767.22 successful reads/sec and 29,001.74 writes/sec, but 6.72 million HTTP 429 responses, 2.99 million scheduler drops, and 383,133 timeouts make it an overload result—not a new clean capacity claim.</w:t>
             </w:r>
           </w:p>
         </w:tc>
@@ -1032,7 +1034,7 @@
         <w:rPr>
           <w:b w:val="0"/>
         </w:rPr>
-        <w:t>The 60-second full-load window produced 608,206 successful reads, 7,544,659 HTTP 429 responses, 2,296,563 generator drops, and 345,915 30-second request timeouts. The two write shards inserted 1,795,797 unique transactions with zero write errors; write p50/p95/p99 was 33/356/635 ms.</w:t>
+        <w:t>The latest 60-second window produced 706,033 successful reads, 6,716,293 HTTP 429 responses, 2,989,529 generator drops, and 383,133 30-second request timeouts. The two write shards inserted 1,740,104 unique transactions during the measured window with zero write errors; aggregate write p50/p95/p99 was 32/548/2,182 ms.</w:t>
       </w:r>
     </w:p>
     <w:p>
@@ -1121,7 +1123,7 @@
         <w:rPr>
           <w:b w:val="0"/>
         </w:rPr>
-        <w:t>The newest full-load run demonstrated that writes can remain at 99.49% of target while the read tier is heavily overloaded; Redis still reported zero blocked clients and zero rejected connections.</w:t>
+        <w:t>The latest full-load run demonstrated that writes can remain at 96.67% of target while the read tier is heavily overloaded. Redis reported 11,648 connected clients after the run, zero blocked clients, zero rejected connections, and zero worker-reported Redis connection errors.</w:t>
       </w:r>
     </w:p>
     <w:p>
@@ -1143,7 +1145,7 @@
         <w:rPr>
           <w:rFonts w:ascii="Arial" w:hAnsi="Arial" w:eastAsia="Arial"/>
         </w:rPr>
-        <w:t>No run met the 180K/sec mixed read target with unchanged payload sizes. The newest run reached 10,136.75 successful reads/sec—5.63% attainment—and cannot be treated as a latency-SLO result because most offered work was rejected, dropped, or timed out.</w:t>
+        <w:t>No run met the 180K/sec mixed read target with unchanged payload sizes. The latest run reached 11,767.22 successful reads/sec—6.54% attainment—and cannot be treated as a latency-SLO result because most offered work was rejected, dropped, or timed out.</w:t>
       </w:r>
     </w:p>
     <w:p>
@@ -1176,7 +1178,7 @@
         <w:rPr>
           <w:rFonts w:ascii="Arial" w:hAnsi="Arial" w:eastAsia="Arial"/>
         </w:rPr>
-        <w:t>The final run did not measure API CPU utilization per worker, so the exact compression headroom and the best gzip-versus-Brotli placement remain open.</w:t>
+        <w:t>The latest run measured every API worker and all ALB target groups, but Redis Cloud Prometheus was unreachable during the load window. Private VPC peering was fixed afterward and passed 15 of 15 post-run scrapes; one more full-load run is required for contemporaneous Redis Cloud CPU, operations, connections, and memory telemetry.</w:t>
       </w:r>
     </w:p>
     <w:p>
@@ -1210,7 +1212,7 @@
         <w:rPr>
           <w:rFonts w:ascii="Arial" w:hAnsi="Arial" w:eastAsia="Arial"/>
         </w:rPr>
-        <w:t>1.  Run a stepped admission-capacity sweep between 3,400 and 15,000 reads/sec to locate the first 429, drop, timeout, and connection-pressure thresholds by pool.</w:t>
+        <w:t>1. Run a pool-by-pool stepped admission sweep with the new worker and ALB telemetry, stopping at the first sustained 429s, event-loop saturation, socket growth, or timeout onset.</w:t>
       </w:r>
     </w:p>
     <w:p>
@@ -1222,7 +1224,7 @@
         <w:rPr>
           <w:rFonts w:ascii="Arial" w:hAnsi="Arial" w:eastAsia="Arial"/>
         </w:rPr>
-        <w:t>2.  Optimize securityByNo, transactionsBySecurity, and transactionsByAccountSecurity, the three remaining indexed paths above 100 ms p95 in the clean 100% run.</w:t>
+        <w:t>2. Separate point reads from indexed searches within the light pool, then optimize securityByNo, transactionsBySecurity, and transactionsByAccountSecurity using the successful-response redis_ms percentiles.</w:t>
       </w:r>
     </w:p>
     <w:p>
@@ -1234,7 +1236,7 @@
         <w:rPr>
           <w:rFonts w:ascii="Arial" w:hAnsi="Arial" w:eastAsia="Arial"/>
         </w:rPr>
-        <w:t>3.  Capture per-worker API CPU, event-loop utilization, active sockets, ALB target metrics, and Redis connections throughout the sweep.</w:t>
+        <w:t>3. Move the large portfolio, activity, and snapshot response path toward thin pass-through or pre-serialized projections; test network-optimized API instances and edge/proxy compression while preserving immediate synchronous updates.</w:t>
       </w:r>
     </w:p>
     <w:p>
@@ -1246,7 +1248,7 @@
         <w:rPr>
           <w:rFonts w:ascii="Arial" w:hAnsi="Arial" w:eastAsia="Arial"/>
         </w:rPr>
-        <w:t>4.  Recompute pool-specific admission and horizontal scale requirements from the last clean step rather than offering 180K immediately.</w:t>
+        <w:t>4. Repeat the instrumented full-load run with private Redis Cloud Prometheus collection active from warm-up through cooldown, and correlate API, ALB, Redis, and network time series.</w:t>
       </w:r>
     </w:p>
     <w:p>
@@ -1258,7 +1260,7 @@
         <w:rPr>
           <w:rFonts w:ascii="Arial" w:hAnsi="Arial" w:eastAsia="Arial"/>
         </w:rPr>
-        <w:t>5.  Repeat capacity with production replication/persistence and add a controlled data-scale sweep at approximately 100 GB, 1 TB, 2 TB, and 4 TB.</w:t>
+        <w:t>5. After the API and payload path is improved, recompute horizontal scale from the last clean per-pool step; then repeat with production replication/persistence and controlled 100 GB, 1 TB, 2 TB, and 4 TB datasets.</w:t>
       </w:r>
     </w:p>
     <w:p>
@@ -3105,7 +3107,7 @@
         <w:rPr>
           <w:rFonts w:ascii="Arial" w:hAnsi="Arial" w:eastAsia="Arial"/>
         </w:rPr>
-        <w:t>3.3 Final optimized sequence and newest full-load stress run</w:t>
+        <w:t>3.3 Final optimized sequence and latest instrumented full-load stress run</w:t>
       </w:r>
     </w:p>
     <w:tbl>
@@ -3705,7 +3707,7 @@
                 <w:color w:val="24313B"/>
                 <w:sz w:val="17"/>
               </w:rPr>
-              <w:t>concurrent-18-hosts-optimized-{gzip,identity}-*; concurrent-18-hosts-20260723T163243Z</w:t>
+              <w:t>concurrent-18-hosts-optimized-{gzip,identity}-*; concurrent-18-hosts-full-load-20260723T185750Z</w:t>
             </w:r>
           </w:p>
         </w:tc>
@@ -3736,7 +3738,7 @@
                 <w:color w:val="24313B"/>
                 <w:sz w:val="17"/>
               </w:rPr>
-              <w:t>Newest full-load reads</w:t>
+              <w:t>Latest full-load reads</w:t>
             </w:r>
           </w:p>
         </w:tc>
@@ -3762,7 +3764,7 @@
                 <w:color w:val="24313B"/>
                 <w:sz w:val="17"/>
               </w:rPr>
-              <w:t>180,000/s target; 10,136.75/s achieved (5.63%); 7,544,659 HTTP 429s; 2,296,563 drops; 345,915 timeouts</w:t>
+              <w:t>180,000/s target; 11,767.22/s achieved (6.54%); 6,716,293 HTTP 429s; 2,989,529 drops; 383,133 timeouts</w:t>
             </w:r>
           </w:p>
         </w:tc>
@@ -3793,7 +3795,7 @@
                 <w:color w:val="24313B"/>
                 <w:sz w:val="17"/>
               </w:rPr>
-              <w:t>Newest full-load writes</w:t>
+              <w:t>Latest full-load writes</w:t>
             </w:r>
           </w:p>
         </w:tc>
@@ -3819,7 +3821,64 @@
                 <w:color w:val="24313B"/>
                 <w:sz w:val="17"/>
               </w:rPr>
-              <w:t>30,000/s target; 29,847.15/s achieved; p50/p95/p99 33/356/635 ms; 4,203 drops; 0 errors</w:t>
+              <w:t>30,000/s target; 29,001.74/s achieved; p50/p95/p99 32/548/2,182 ms; 49,881 drops; 0 errors</w:t>
+            </w:r>
+          </w:p>
+        </w:tc>
+      </w:tr>
+      <w:tr>
+        <w:trPr>
+          <w:cantSplit/>
+        </w:trPr>
+        <w:tc>
+          <w:tcPr>
+            <w:tcW w:type="dxa" w:w="2232"/>
+            <w:tcMar>
+              <w:top w:w="75" w:type="dxa"/>
+              <w:start w:w="75" w:type="dxa"/>
+              <w:bottom w:w="75" w:type="dxa"/>
+              <w:end w:w="75" w:type="dxa"/>
+            </w:tcMar>
+            <w:vAlign w:val="center"/>
+          </w:tcPr>
+          <w:p>
+            <w:pPr>
+              <w:spacing w:after="0"/>
+              <w:jc w:val="left"/>
+            </w:pPr>
+            <w:r>
+              <w:rPr>
+                <w:rFonts w:ascii="Arial" w:hAnsi="Arial" w:eastAsia="Arial"/>
+                <w:color w:val="24313B"/>
+                <w:sz w:val="17"/>
+              </w:rPr>
+              <w:t>Latest telemetry</w:t>
+            </w:r>
+          </w:p>
+        </w:tc>
+        <w:tc>
+          <w:tcPr>
+            <w:tcW w:type="dxa" w:w="7848"/>
+            <w:tcMar>
+              <w:top w:w="75" w:type="dxa"/>
+              <w:start w:w="75" w:type="dxa"/>
+              <w:bottom w:w="75" w:type="dxa"/>
+              <w:end w:w="75" w:type="dxa"/>
+            </w:tcMar>
+            <w:vAlign w:val="center"/>
+          </w:tcPr>
+          <w:p>
+            <w:pPr>
+              <w:spacing w:after="0"/>
+              <w:jc w:val="left"/>
+            </w:pPr>
+            <w:r>
+              <w:rPr>
+                <w:rFonts w:ascii="Arial" w:hAnsi="Arial" w:eastAsia="Arial"/>
+                <w:color w:val="24313B"/>
+                <w:sz w:val="17"/>
+              </w:rPr>
+              <w:t>128/128 workers sampled; all Redis pools ready with 0 errors; 128 ALB targets healthy; Redis ended at 11,648 clients with 0 rejected connections</w:t>
             </w:r>
           </w:p>
         </w:tc>
@@ -6234,6 +6293,173 @@
           </w:p>
         </w:tc>
       </w:tr>
+      <w:tr>
+        <w:trPr>
+          <w:cantSplit/>
+        </w:trPr>
+        <w:tc>
+          <w:tcPr>
+            <w:tcW w:type="dxa" w:w="2088"/>
+            <w:shd w:fill="F2F6F8"/>
+            <w:tcMar>
+              <w:top w:w="75" w:type="dxa"/>
+              <w:start w:w="75" w:type="dxa"/>
+              <w:bottom w:w="75" w:type="dxa"/>
+              <w:end w:w="75" w:type="dxa"/>
+            </w:tcMar>
+            <w:vAlign w:val="center"/>
+          </w:tcPr>
+          <w:p>
+            <w:pPr>
+              <w:spacing w:after="0"/>
+              <w:jc w:val="left"/>
+            </w:pPr>
+            <w:r>
+              <w:rPr>
+                <w:rFonts w:ascii="Arial" w:hAnsi="Arial" w:eastAsia="Arial"/>
+                <w:color w:val="24313B"/>
+                <w:sz w:val="14"/>
+              </w:rPr>
+              <w:t>23 Jul instrumented full load</w:t>
+            </w:r>
+          </w:p>
+        </w:tc>
+        <w:tc>
+          <w:tcPr>
+            <w:tcW w:type="dxa" w:w="1152"/>
+            <w:shd w:fill="F2F6F8"/>
+            <w:tcMar>
+              <w:top w:w="75" w:type="dxa"/>
+              <w:start w:w="75" w:type="dxa"/>
+              <w:bottom w:w="75" w:type="dxa"/>
+              <w:end w:w="75" w:type="dxa"/>
+            </w:tcMar>
+            <w:vAlign w:val="center"/>
+          </w:tcPr>
+          <w:p>
+            <w:pPr>
+              <w:spacing w:after="0"/>
+              <w:jc w:val="right"/>
+            </w:pPr>
+            <w:r>
+              <w:rPr>
+                <w:rFonts w:ascii="Arial" w:hAnsi="Arial" w:eastAsia="Arial"/>
+                <w:color w:val="24313B"/>
+                <w:sz w:val="14"/>
+              </w:rPr>
+              <w:t>180,000</w:t>
+            </w:r>
+          </w:p>
+        </w:tc>
+        <w:tc>
+          <w:tcPr>
+            <w:tcW w:type="dxa" w:w="1296"/>
+            <w:shd w:fill="F2F6F8"/>
+            <w:tcMar>
+              <w:top w:w="75" w:type="dxa"/>
+              <w:start w:w="75" w:type="dxa"/>
+              <w:bottom w:w="75" w:type="dxa"/>
+              <w:end w:w="75" w:type="dxa"/>
+            </w:tcMar>
+            <w:vAlign w:val="center"/>
+          </w:tcPr>
+          <w:p>
+            <w:pPr>
+              <w:spacing w:after="0"/>
+              <w:jc w:val="right"/>
+            </w:pPr>
+            <w:r>
+              <w:rPr>
+                <w:rFonts w:ascii="Arial" w:hAnsi="Arial" w:eastAsia="Arial"/>
+                <w:color w:val="24313B"/>
+                <w:sz w:val="14"/>
+              </w:rPr>
+              <w:t>11,767.22</w:t>
+            </w:r>
+          </w:p>
+        </w:tc>
+        <w:tc>
+          <w:tcPr>
+            <w:tcW w:type="dxa" w:w="1368"/>
+            <w:shd w:fill="F2F6F8"/>
+            <w:tcMar>
+              <w:top w:w="75" w:type="dxa"/>
+              <w:start w:w="75" w:type="dxa"/>
+              <w:bottom w:w="75" w:type="dxa"/>
+              <w:end w:w="75" w:type="dxa"/>
+            </w:tcMar>
+            <w:vAlign w:val="center"/>
+          </w:tcPr>
+          <w:p>
+            <w:pPr>
+              <w:spacing w:after="0"/>
+              <w:jc w:val="right"/>
+            </w:pPr>
+            <w:r>
+              <w:rPr>
+                <w:rFonts w:ascii="Arial" w:hAnsi="Arial" w:eastAsia="Arial"/>
+                <w:color w:val="24313B"/>
+                <w:sz w:val="14"/>
+              </w:rPr>
+              <w:t>29,001.74</w:t>
+            </w:r>
+          </w:p>
+        </w:tc>
+        <w:tc>
+          <w:tcPr>
+            <w:tcW w:type="dxa" w:w="1080"/>
+            <w:shd w:fill="F2F6F8"/>
+            <w:tcMar>
+              <w:top w:w="75" w:type="dxa"/>
+              <w:start w:w="75" w:type="dxa"/>
+              <w:bottom w:w="75" w:type="dxa"/>
+              <w:end w:w="75" w:type="dxa"/>
+            </w:tcMar>
+            <w:vAlign w:val="center"/>
+          </w:tcPr>
+          <w:p>
+            <w:pPr>
+              <w:spacing w:after="0"/>
+              <w:jc w:val="right"/>
+            </w:pPr>
+            <w:r>
+              <w:rPr>
+                <w:rFonts w:ascii="Arial" w:hAnsi="Arial" w:eastAsia="Arial"/>
+                <w:color w:val="24313B"/>
+                <w:sz w:val="14"/>
+              </w:rPr>
+              <w:t>548 ms</w:t>
+            </w:r>
+          </w:p>
+        </w:tc>
+        <w:tc>
+          <w:tcPr>
+            <w:tcW w:type="dxa" w:w="3096"/>
+            <w:shd w:fill="F2F6F8"/>
+            <w:tcMar>
+              <w:top w:w="75" w:type="dxa"/>
+              <w:start w:w="75" w:type="dxa"/>
+              <w:bottom w:w="75" w:type="dxa"/>
+              <w:end w:w="75" w:type="dxa"/>
+            </w:tcMar>
+            <w:vAlign w:val="center"/>
+          </w:tcPr>
+          <w:p>
+            <w:pPr>
+              <w:spacing w:after="0"/>
+              <w:jc w:val="left"/>
+            </w:pPr>
+            <w:r>
+              <w:rPr>
+                <w:rFonts w:ascii="Arial" w:hAnsi="Arial" w:eastAsia="Arial"/>
+                <w:color w:val="24313B"/>
+                <w:sz w:val="14"/>
+              </w:rPr>
+              <w:t>higher reads; API event-loop/admission saturated</w:t>
+            </w:r>
+          </w:p>
+        </w:tc>
+      </w:tr>
     </w:tbl>
     <w:p>
       <w:pPr>
@@ -6391,7 +6617,7 @@
           <w:color w:val="61717D"/>
           <w:sz w:val="17"/>
         </w:rPr>
-        <w:t>Figure 3. Final tested AWS and Redis Cloud deployment boundaries. The same 146-instance AWS fleet and seven-primary Redis Cloud database remain provisioned after the newest full-load test.</w:t>
+        <w:t>Figure 3. Final tested AWS and Redis Cloud deployment boundaries. The 146-instance AWS fleet and clustered Redis Cloud database remain provisioned after the latest full-load test; private VPC peering now carries Redis Cloud Prometheus traffic on port 8070.</w:t>
       </w:r>
     </w:p>
     <w:p>
@@ -7758,7 +7984,7 @@
         <w:rPr>
           <w:rFonts w:ascii="Arial" w:hAnsi="Arial" w:eastAsia="Arial"/>
         </w:rPr>
-        <w:t>The Redis client is node-redis 4.7 createCluster, with explicit routing keys and useReplicas=false. Pool-specific client counts reduced the configured logical total to 1,664 even as worker count doubled. A logical cluster client maintains connections to discovered primaries, so physical sockets can exceed the logical count; Redis nevertheless reported zero rejected connections throughout the combined sequence.</w:t>
+        <w:t>The Redis client is node-redis 4.7 createCluster, with explicit routing keys and useReplicas=false. Pool-specific client counts total 1,664 logical cluster clients. During the latest full load every worker reported its configured pool ready with zero Redis connection errors; Redis INFO ended at 11,648 physical clients, zero blocked clients, and zero rejected connections.</w:t>
       </w:r>
     </w:p>
     <w:p>
@@ -8317,6 +8543,65 @@
           </w:p>
         </w:tc>
       </w:tr>
+      <w:tr>
+        <w:trPr>
+          <w:cantSplit/>
+        </w:trPr>
+        <w:tc>
+          <w:tcPr>
+            <w:tcW w:type="dxa" w:w="2448"/>
+            <w:shd w:fill="F2F6F8"/>
+            <w:tcMar>
+              <w:top w:w="75" w:type="dxa"/>
+              <w:start w:w="75" w:type="dxa"/>
+              <w:bottom w:w="75" w:type="dxa"/>
+              <w:end w:w="75" w:type="dxa"/>
+            </w:tcMar>
+            <w:vAlign w:val="center"/>
+          </w:tcPr>
+          <w:p>
+            <w:pPr>
+              <w:spacing w:after="0"/>
+              <w:jc w:val="left"/>
+            </w:pPr>
+            <w:r>
+              <w:rPr>
+                <w:rFonts w:ascii="Arial" w:hAnsi="Arial" w:eastAsia="Arial"/>
+                <w:color w:val="24313B"/>
+                <w:sz w:val="17"/>
+              </w:rPr>
+              <w:t>Control-plane topology</w:t>
+            </w:r>
+          </w:p>
+        </w:tc>
+        <w:tc>
+          <w:tcPr>
+            <w:tcW w:type="dxa" w:w="7632"/>
+            <w:shd w:fill="F2F6F8"/>
+            <w:tcMar>
+              <w:top w:w="75" w:type="dxa"/>
+              <w:start w:w="75" w:type="dxa"/>
+              <w:bottom w:w="75" w:type="dxa"/>
+              <w:end w:w="75" w:type="dxa"/>
+            </w:tcMar>
+            <w:vAlign w:val="center"/>
+          </w:tcPr>
+          <w:p>
+            <w:pPr>
+              <w:spacing w:after="0"/>
+              <w:jc w:val="left"/>
+            </w:pPr>
+            <w:r>
+              <w:rPr>
+                <w:rFonts w:ascii="Arial" w:hAnsi="Arial" w:eastAsia="Arial"/>
+                <w:color w:val="24313B"/>
+                <w:sz w:val="17"/>
+              </w:rPr>
+              <w:t>100 shards reported by Redis Cloud Prometheus; cluster-aware client routing</w:t>
+            </w:r>
+          </w:p>
+        </w:tc>
+      </w:tr>
     </w:tbl>
     <w:p>
       <w:pPr>
@@ -8377,7 +8662,7 @@
                 <w:color w:val="24313B"/>
                 <w:sz w:val="18"/>
               </w:rPr>
-              <w:t>After the newest full-load test, all 146 c7i.large instances (128 API workers and 18 generators) and the seven-primary Redis Cloud database remain provisioned and billable. Redis 8.6.2 health and all five indexes passed validation. Terraform state contains 64 AWS and 4 Redis Cloud resources; the separate versioned S3 backup remains retained.</w:t>
+              <w:t>After the latest full-load test, all 146 c7i.large instances (128 API workers and 18 generators) and the Redis Cloud clustered database remain provisioned and billable. Redis 8.6.2 health and all five indexes passed validation. Private VPC peering now exposes Redis Cloud metrics on port 8070, and the separate versioned S3 backup remains retained.</w:t>
             </w:r>
           </w:p>
         </w:tc>
@@ -8404,7 +8689,7 @@
         <w:rPr>
           <w:rFonts w:ascii="Arial" w:hAnsi="Arial" w:eastAsia="Arial"/>
         </w:rPr>
-        <w:t>The one-time seed completed before an on-demand Redis Cloud export, and a later scheduled export captured the prior post-benchmark state. The newest full-load run restored the retained RDB set and then inserted 1,795,797 unique runtime transactions. No new post-run backup was created, so the retained S3 manifest remains the repeatable pre-run baseline rather than a copy of the current live database.</w:t>
+        <w:t>The one-time seed completed before an on-demand Redis Cloud export, and a later scheduled export captured the prior post-benchmark state. The latest full-load run used the retained baseline and inserted 1,740,104 unique runtime transactions during the measured window (1,750,119 total for the two writer processes). No new post-run backup was created, so the retained S3 manifest remains the repeatable pre-run baseline rather than a copy of the current live database.</w:t>
       </w:r>
     </w:p>
     <w:p>
@@ -9155,7 +9440,7 @@
         <w:rPr>
           <w:rFonts w:ascii="Arial" w:hAnsi="Arial" w:eastAsia="Arial"/>
         </w:rPr>
-        <w:t>This is a synchronous materialization pattern. It avoids stale account reads but moves projection maintenance onto the write path. The clean 100% gzip run achieved 29,995.71 writes/sec at p95 12 ms. Under the newest 180K-read/sec stress, writes still achieved 29,847.15/sec with zero errors, but p95 rose to 356 ms; Function CPU/runtime and durability overhead must therefore be monitored.</w:t>
+        <w:t>This is a synchronous materialization pattern. It avoids stale account reads but moves projection maintenance onto the write path. The clean 100% gzip run achieved 29,995.71 writes/sec at p95 12 ms. Under the latest 180K-read/sec stress, writes achieved 29,001.74/sec with zero errors, but p95 rose to 548 ms; Function CPU/runtime and durability overhead must therefore be monitored.</w:t>
       </w:r>
     </w:p>
     <w:p>
@@ -10355,7 +10640,7 @@
         <w:rPr>
           <w:rFonts w:ascii="Arial" w:hAnsi="Arial" w:eastAsia="Arial"/>
         </w:rPr>
-        <w:t>Client commands: the desired mix is about 210K top-level commands/sec. The clean composite point is 2,555 reads/sec plus 29,995 writes/sec; the newest stress run completed about 39,983.90 successful top-level commands/sec. Do not equate client request count with Redis shard CPU capacity.</w:t>
+        <w:t>Client commands: the desired mix is about 210K top-level commands/sec. The clean composite point is 2,555 reads/sec plus 29,995 writes/sec; the latest stress run completed about 40,768.96 successful top-level commands/sec. Do not equate client request count with Redis shard CPU capacity.</w:t>
       </w:r>
     </w:p>
     <w:p>
@@ -10377,7 +10662,7 @@
         <w:rPr>
           <w:rFonts w:ascii="Arial" w:hAnsi="Arial" w:eastAsia="Arial"/>
         </w:rPr>
-        <w:t>API admission: the newest valid 180K stress run produced 7,544,659 HTTP 429 responses, 2,296,563 scheduler drops, and 345,915 request timeouts. The clean 25%–100% sequence had zero read drops/errors, so the overload is an admission and connection-capacity result rather than a regression in the clean baseline.</w:t>
+        <w:t>API admission: the latest 180K stress run produced 6,716,293 HTTP 429 responses, 2,989,529 scheduler drops, and 383,133 request timeouts. All 128 ALB targets remained healthy, while worker event-loop p95 reached 100%; the overload is an application admission and event-loop capacity result rather than an ALB health or Redis connection-error result.</w:t>
       </w:r>
     </w:p>
     <w:p>
@@ -10410,7 +10695,7 @@
         <w:rPr>
           <w:rFonts w:ascii="Arial" w:hAnsi="Arial" w:eastAsia="Arial"/>
         </w:rPr>
-        <w:t>Compression: real gzip reduced matched clean-load response traffic from 454.24 MB/sec to 53.72 MB/sec (88.2%). During the newest stress run, successful gzip responses used 150.99 MB/sec of wire traffic for 1,280.56 MB/sec of uncompressed API payload, but compression did not remove admission saturation.</w:t>
+        <w:t>Compression: real gzip reduced matched clean-load response traffic from 454.24 MB/sec to 53.72 MB/sec (88.2%). The latest instrumented full-load run intentionally used identity responses and delivered 1,609.86 MB/sec of successful response data, so it must not be compared directly with the matched gzip control.</w:t>
       </w:r>
     </w:p>
     <w:p>
@@ -10462,13 +10747,7 @@
         <w:rPr>
           <w:b/>
         </w:rPr>
-        <w:t xml:space="preserve">Why it fits. </w:t>
-      </w:r>
-      <w:r>
-        <w:rPr>
-          <w:b w:val="0"/>
-        </w:rPr>
-        <w:t>The tested design uses seven primaries and a cluster-aware node-redis client. Slot discovery and direct shard routing distribute memory and independent account workloads, while useReplicas=false preserves immediately-current primary reads.</w:t>
+        <w:t>Why it fits. The tested design uses Redis Cloud OSS Cluster API and a cluster-aware node-redis client; the control plane reports 100 shards. Slot discovery and direct shard routing distribute memory and independent account workloads, while useReplicas=false preserves immediately-current primary reads.</w:t>
       </w:r>
     </w:p>
     <w:p>
@@ -10635,7 +10914,7 @@
         <w:rPr>
           <w:b w:val="0"/>
         </w:rPr>
-        <w:t>Full-load confirmation. Gzip remained enabled during the newest 180K-read/sec stress run, yet read attainment was 5.63%. This confirms that compression is a bandwidth optimization, not a substitute for API admission and connection capacity. The stress run was not a matched identity-versus-gzip A/B.</w:t>
+        <w:t>Full-load qualification. The latest instrumented 180K-read/sec stress run sent an empty Accept-Encoding value and therefore used identity responses. It attained 6.54% of the read target while the API event loop and admission limits saturated. The separate matched 3,400-read/sec control remains the evidence for gzip: compression is a bandwidth optimization, not a Redis query-speed optimization.</w:t>
       </w:r>
     </w:p>
     <w:p>
@@ -11549,7 +11828,7 @@
           <w:color w:val="61717D"/>
           <w:sz w:val="17"/>
         </w:rPr>
-        <w:t>Live verification before the earlier teardown: JSON.GET acct:{acct:A00000001}:info $ returned this object with a 191-byte data payload. The newest valid full-load average for accountById was 196.30 bytes across randomized accounts.</w:t>
+        <w:t>Live verification before the earlier teardown: JSON.GET acct:{acct:A00000001}:info $ returned this object with a 191-byte data payload. The latest full-load average for accountById was 196.27 bytes across randomized accounts.</w:t>
       </w:r>
     </w:p>
     <w:p>
@@ -12722,7 +13001,7 @@
                 <w:color w:val="24313B"/>
                 <w:sz w:val="13"/>
               </w:rPr>
-              <w:t>119,170 B</w:t>
+              <w:t>119,171 B</w:t>
             </w:r>
           </w:p>
         </w:tc>
@@ -13103,7 +13382,7 @@
                 <w:color w:val="24313B"/>
                 <w:sz w:val="13"/>
               </w:rPr>
-              <w:t>33,404 B</w:t>
+              <w:t>33,385 B</w:t>
             </w:r>
           </w:p>
         </w:tc>
@@ -13296,7 +13575,7 @@
                 <w:color w:val="24313B"/>
                 <w:sz w:val="13"/>
               </w:rPr>
-              <w:t>35,304 B</w:t>
+              <w:t>34,943 B</w:t>
             </w:r>
           </w:p>
         </w:tc>
@@ -13484,7 +13763,7 @@
                 <w:color w:val="24313B"/>
                 <w:sz w:val="13"/>
               </w:rPr>
-              <w:t>717 B</w:t>
+              <w:t>716 B</w:t>
             </w:r>
           </w:p>
         </w:tc>
@@ -13677,7 +13956,7 @@
                 <w:color w:val="24313B"/>
                 <w:sz w:val="13"/>
               </w:rPr>
-              <w:t>294,024 B</w:t>
+              <w:t>294,029 B</w:t>
             </w:r>
           </w:p>
         </w:tc>
@@ -13865,7 +14144,7 @@
                 <w:color w:val="24313B"/>
                 <w:sz w:val="13"/>
               </w:rPr>
-              <w:t>136,901 B</w:t>
+              <w:t>136,899 B</w:t>
             </w:r>
           </w:p>
         </w:tc>
@@ -14058,7 +14337,7 @@
                 <w:color w:val="24313B"/>
                 <w:sz w:val="13"/>
               </w:rPr>
-              <w:t>430,898 B</w:t>
+              <w:t>430,910 B</w:t>
             </w:r>
           </w:p>
         </w:tc>
@@ -19859,7 +20138,7 @@
         <w:rPr>
           <w:rFonts w:ascii="Arial" w:hAnsi="Arial" w:eastAsia="Arial"/>
         </w:rPr>
-        <w:t>The aggregate worst-p95 difference between identity and gzip is normal run-to-run variation, not evidence that compression reduced latency. The pattern-level comparison is more diagnostic: accountPortfolioJoin increased from 16 ms to 34 ms p95 and accountSnapshot from 17 ms to 41 ms while wire traffic fell sharply. The newest 180K stress run used gzip but was not a matched compression control; its 5.63% read attainment reinforces that gzip does not remove API admission limits.</w:t>
+        <w:t>The aggregate worst-p95 difference between identity and gzip is normal run-to-run variation, not evidence that compression reduced latency. The pattern-level comparison is more diagnostic: accountPortfolioJoin increased from 16 ms to 34 ms p95 and accountSnapshot from 17 ms to 41 ms while wire traffic fell sharply. The latest instrumented 180K stress used identity responses, so it is an overload characterization—not a matched compression control.</w:t>
       </w:r>
     </w:p>
     <w:p>
@@ -19887,7 +20166,7 @@
         <w:rPr>
           <w:b w:val="0"/>
         </w:rPr>
-        <w:t>The valid 60-second run offered the full production-ratio target through 16 read generators while two dedicated write generators shared 30K writes/sec. Reads achieved 10,136.75/sec (5.63%); writes achieved 29,847.15/sec (99.49%) with zero write errors.</w:t>
+        <w:t>The latest valid 60-second run offered the full production-ratio target through 16 read generators while two dedicated write generators shared 30K writes/sec. Reads achieved 11,767.22/sec (6.54%); writes achieved 29,001.74/sec (96.67%) with zero write errors.</w:t>
       </w:r>
     </w:p>
     <w:tbl>
@@ -20169,7 +20448,7 @@
                 <w:color w:val="FFFFFF"/>
                 <w:sz w:val="13"/>
               </w:rPr>
-              <w:t>Avg wire B</w:t>
+              <w:t>Avg response B</w:t>
             </w:r>
           </w:p>
         </w:tc>
@@ -20252,7 +20531,7 @@
                 <w:color w:val="24313B"/>
                 <w:sz w:val="13"/>
               </w:rPr>
-              <w:t>359.23</w:t>
+              <w:t>376.78</w:t>
             </w:r>
           </w:p>
         </w:tc>
@@ -20278,7 +20557,7 @@
                 <w:color w:val="24313B"/>
                 <w:sz w:val="13"/>
               </w:rPr>
-              <w:t>3.99%</w:t>
+              <w:t>4.19%</w:t>
             </w:r>
           </w:p>
         </w:tc>
@@ -20304,7 +20583,7 @@
                 <w:color w:val="24313B"/>
                 <w:sz w:val="13"/>
               </w:rPr>
-              <w:t>130</w:t>
+              <w:t>134</w:t>
             </w:r>
           </w:p>
         </w:tc>
@@ -20382,7 +20661,7 @@
                 <w:color w:val="24313B"/>
                 <w:sz w:val="13"/>
               </w:rPr>
-              <w:t>196.30</w:t>
+              <w:t>196.27</w:t>
             </w:r>
           </w:p>
         </w:tc>
@@ -20408,7 +20687,7 @@
                 <w:color w:val="24313B"/>
                 <w:sz w:val="13"/>
               </w:rPr>
-              <w:t>406.59</w:t>
+              <w:t>406.76</w:t>
             </w:r>
           </w:p>
         </w:tc>
@@ -20494,7 +20773,7 @@
                 <w:color w:val="24313B"/>
                 <w:sz w:val="13"/>
               </w:rPr>
-              <w:t>351.48</w:t>
+              <w:t>408.79</w:t>
             </w:r>
           </w:p>
         </w:tc>
@@ -20521,7 +20800,7 @@
                 <w:color w:val="24313B"/>
                 <w:sz w:val="13"/>
               </w:rPr>
-              <w:t>3.91%</w:t>
+              <w:t>4.54%</w:t>
             </w:r>
           </w:p>
         </w:tc>
@@ -20548,7 +20827,7 @@
                 <w:color w:val="24313B"/>
                 <w:sz w:val="13"/>
               </w:rPr>
-              <w:t>130</w:t>
+              <w:t>135</w:t>
             </w:r>
           </w:p>
         </w:tc>
@@ -20656,7 +20935,7 @@
                 <w:color w:val="24313B"/>
                 <w:sz w:val="13"/>
               </w:rPr>
-              <w:t>471.67</w:t>
+              <w:t>8,397.31</w:t>
             </w:r>
           </w:p>
         </w:tc>
@@ -20739,7 +21018,7 @@
                 <w:color w:val="24313B"/>
                 <w:sz w:val="13"/>
               </w:rPr>
-              <w:t>314.91</w:t>
+              <w:t>329.49</w:t>
             </w:r>
           </w:p>
         </w:tc>
@@ -20765,7 +21044,7 @@
                 <w:color w:val="24313B"/>
                 <w:sz w:val="13"/>
               </w:rPr>
-              <w:t>3.50%</w:t>
+              <w:t>3.66%</w:t>
             </w:r>
           </w:p>
         </w:tc>
@@ -20791,7 +21070,7 @@
                 <w:color w:val="24313B"/>
                 <w:sz w:val="13"/>
               </w:rPr>
-              <w:t>129</w:t>
+              <w:t>132</w:t>
             </w:r>
           </w:p>
         </w:tc>
@@ -20869,7 +21148,7 @@
                 <w:color w:val="24313B"/>
                 <w:sz w:val="13"/>
               </w:rPr>
-              <w:t>332.63</w:t>
+              <w:t>332.58</w:t>
             </w:r>
           </w:p>
         </w:tc>
@@ -20895,7 +21174,7 @@
                 <w:color w:val="24313B"/>
                 <w:sz w:val="13"/>
               </w:rPr>
-              <w:t>611.32</w:t>
+              <w:t>611.84</w:t>
             </w:r>
           </w:p>
         </w:tc>
@@ -20981,7 +21260,7 @@
                 <w:color w:val="24313B"/>
                 <w:sz w:val="13"/>
               </w:rPr>
-              <w:t>401.27</w:t>
+              <w:t>466.96</w:t>
             </w:r>
           </w:p>
         </w:tc>
@@ -21008,7 +21287,7 @@
                 <w:color w:val="24313B"/>
                 <w:sz w:val="13"/>
               </w:rPr>
-              <w:t>4.46%</w:t>
+              <w:t>5.19%</w:t>
             </w:r>
           </w:p>
         </w:tc>
@@ -21116,7 +21395,7 @@
                 <w:color w:val="24313B"/>
                 <w:sz w:val="13"/>
               </w:rPr>
-              <w:t>8,192.01</w:t>
+              <w:t>8,192.00</w:t>
             </w:r>
           </w:p>
         </w:tc>
@@ -21143,7 +21422,7 @@
                 <w:color w:val="24313B"/>
                 <w:sz w:val="13"/>
               </w:rPr>
-              <w:t>431.66</w:t>
+              <w:t>8,415.07</w:t>
             </w:r>
           </w:p>
         </w:tc>
@@ -21226,7 +21505,7 @@
                 <w:color w:val="24313B"/>
                 <w:sz w:val="13"/>
               </w:rPr>
-              <w:t>283.85</w:t>
+              <w:t>340.45</w:t>
             </w:r>
           </w:p>
         </w:tc>
@@ -21252,7 +21531,7 @@
                 <w:color w:val="24313B"/>
                 <w:sz w:val="13"/>
               </w:rPr>
-              <w:t>3.15%</w:t>
+              <w:t>3.78%</w:t>
             </w:r>
           </w:p>
         </w:tc>
@@ -21278,7 +21557,7 @@
                 <w:color w:val="24313B"/>
                 <w:sz w:val="13"/>
               </w:rPr>
-              <w:t>54</w:t>
+              <w:t>89</w:t>
             </w:r>
           </w:p>
         </w:tc>
@@ -21304,7 +21583,7 @@
                 <w:color w:val="24313B"/>
                 <w:sz w:val="13"/>
               </w:rPr>
-              <w:t>116</w:t>
+              <w:t>170</w:t>
             </w:r>
           </w:p>
         </w:tc>
@@ -21330,7 +21609,7 @@
                 <w:color w:val="24313B"/>
                 <w:sz w:val="13"/>
               </w:rPr>
-              <w:t>266</w:t>
+              <w:t>375</w:t>
             </w:r>
           </w:p>
         </w:tc>
@@ -21356,7 +21635,7 @@
                 <w:color w:val="24313B"/>
                 <w:sz w:val="13"/>
               </w:rPr>
-              <w:t>119,169.90</w:t>
+              <w:t>119,170.68</w:t>
             </w:r>
           </w:p>
         </w:tc>
@@ -21382,7 +21661,7 @@
                 <w:color w:val="24313B"/>
                 <w:sz w:val="13"/>
               </w:rPr>
-              <w:t>13,341.01</w:t>
+              <w:t>119,417.25</w:t>
             </w:r>
           </w:p>
         </w:tc>
@@ -21468,7 +21747,7 @@
                 <w:color w:val="24313B"/>
                 <w:sz w:val="13"/>
               </w:rPr>
-              <w:t>464.31</w:t>
+              <w:t>443.36</w:t>
             </w:r>
           </w:p>
         </w:tc>
@@ -21495,7 +21774,7 @@
                 <w:color w:val="24313B"/>
                 <w:sz w:val="13"/>
               </w:rPr>
-              <w:t>5.16%</w:t>
+              <w:t>4.93%</w:t>
             </w:r>
           </w:p>
         </w:tc>
@@ -21522,7 +21801,7 @@
                 <w:color w:val="24313B"/>
                 <w:sz w:val="13"/>
               </w:rPr>
-              <w:t>120</w:t>
+              <w:t>127</w:t>
             </w:r>
           </w:p>
         </w:tc>
@@ -21630,7 +21909,7 @@
                 <w:color w:val="24313B"/>
                 <w:sz w:val="13"/>
               </w:rPr>
-              <w:t>466.37</w:t>
+              <w:t>8,443.20</w:t>
             </w:r>
           </w:p>
         </w:tc>
@@ -21713,7 +21992,7 @@
                 <w:color w:val="24313B"/>
                 <w:sz w:val="13"/>
               </w:rPr>
-              <w:t>383.65</w:t>
+              <w:t>342.77</w:t>
             </w:r>
           </w:p>
         </w:tc>
@@ -21739,7 +22018,7 @@
                 <w:color w:val="24313B"/>
                 <w:sz w:val="13"/>
               </w:rPr>
-              <w:t>4.26%</w:t>
+              <w:t>3.81%</w:t>
             </w:r>
           </w:p>
         </w:tc>
@@ -21765,7 +22044,7 @@
                 <w:color w:val="24313B"/>
                 <w:sz w:val="13"/>
               </w:rPr>
-              <w:t>6</w:t>
+              <w:t>9</w:t>
             </w:r>
           </w:p>
         </w:tc>
@@ -21791,7 +22070,7 @@
                 <w:color w:val="24313B"/>
                 <w:sz w:val="13"/>
               </w:rPr>
-              <w:t>31</w:t>
+              <w:t>41</w:t>
             </w:r>
           </w:p>
         </w:tc>
@@ -21817,7 +22096,7 @@
                 <w:color w:val="24313B"/>
                 <w:sz w:val="13"/>
               </w:rPr>
-              <w:t>136</w:t>
+              <w:t>82</w:t>
             </w:r>
           </w:p>
         </w:tc>
@@ -21843,7 +22122,7 @@
                 <w:color w:val="24313B"/>
                 <w:sz w:val="13"/>
               </w:rPr>
-              <w:t>33,404.32</w:t>
+              <w:t>33,384.83</w:t>
             </w:r>
           </w:p>
         </w:tc>
@@ -21869,7 +22148,7 @@
                 <w:color w:val="24313B"/>
                 <w:sz w:val="13"/>
               </w:rPr>
-              <w:t>3,989.80</w:t>
+              <w:t>33,621.57</w:t>
             </w:r>
           </w:p>
         </w:tc>
@@ -21955,7 +22234,7 @@
                 <w:color w:val="24313B"/>
                 <w:sz w:val="13"/>
               </w:rPr>
-              <w:t>253.24</w:t>
+              <w:t>301.27</w:t>
             </w:r>
           </w:p>
         </w:tc>
@@ -21982,7 +22261,7 @@
                 <w:color w:val="24313B"/>
                 <w:sz w:val="13"/>
               </w:rPr>
-              <w:t>2.81%</w:t>
+              <w:t>3.35%</w:t>
             </w:r>
           </w:p>
         </w:tc>
@@ -22009,7 +22288,7 @@
                 <w:color w:val="24313B"/>
                 <w:sz w:val="13"/>
               </w:rPr>
-              <w:t>6</w:t>
+              <w:t>9</w:t>
             </w:r>
           </w:p>
         </w:tc>
@@ -22036,7 +22315,7 @@
                 <w:color w:val="24313B"/>
                 <w:sz w:val="13"/>
               </w:rPr>
-              <w:t>35</w:t>
+              <w:t>55</w:t>
             </w:r>
           </w:p>
         </w:tc>
@@ -22063,7 +22342,7 @@
                 <w:color w:val="24313B"/>
                 <w:sz w:val="13"/>
               </w:rPr>
-              <w:t>759</w:t>
+              <w:t>914</w:t>
             </w:r>
           </w:p>
         </w:tc>
@@ -22090,7 +22369,7 @@
                 <w:color w:val="24313B"/>
                 <w:sz w:val="13"/>
               </w:rPr>
-              <w:t>35,303.52</w:t>
+              <w:t>34,943.40</w:t>
             </w:r>
           </w:p>
         </w:tc>
@@ -22117,7 +22396,7 @@
                 <w:color w:val="24313B"/>
                 <w:sz w:val="13"/>
               </w:rPr>
-              <w:t>3,498.31</w:t>
+              <w:t>35,273.70</w:t>
             </w:r>
           </w:p>
         </w:tc>
@@ -22200,7 +22479,7 @@
                 <w:color w:val="24313B"/>
                 <w:sz w:val="13"/>
               </w:rPr>
-              <w:t>422.00</w:t>
+              <w:t>380.05</w:t>
             </w:r>
           </w:p>
         </w:tc>
@@ -22226,7 +22505,7 @@
                 <w:color w:val="24313B"/>
                 <w:sz w:val="13"/>
               </w:rPr>
-              <w:t>4.69%</w:t>
+              <w:t>4.22%</w:t>
             </w:r>
           </w:p>
         </w:tc>
@@ -22252,7 +22531,7 @@
                 <w:color w:val="24313B"/>
                 <w:sz w:val="13"/>
               </w:rPr>
-              <w:t>119</w:t>
+              <w:t>122</w:t>
             </w:r>
           </w:p>
         </w:tc>
@@ -22330,7 +22609,7 @@
                 <w:color w:val="24313B"/>
                 <w:sz w:val="13"/>
               </w:rPr>
-              <w:t>716.62</w:t>
+              <w:t>715.60</w:t>
             </w:r>
           </w:p>
         </w:tc>
@@ -22356,7 +22635,7 @@
                 <w:color w:val="24313B"/>
                 <w:sz w:val="13"/>
               </w:rPr>
-              <w:t>479.56</w:t>
+              <w:t>1,065.95</w:t>
             </w:r>
           </w:p>
         </w:tc>
@@ -22442,7 +22721,7 @@
                 <w:color w:val="24313B"/>
                 <w:sz w:val="13"/>
               </w:rPr>
-              <w:t>1,827.00</w:t>
+              <w:t>2,426.60</w:t>
             </w:r>
           </w:p>
         </w:tc>
@@ -22469,7 +22748,7 @@
                 <w:color w:val="24313B"/>
                 <w:sz w:val="13"/>
               </w:rPr>
-              <w:t>4.06%</w:t>
+              <w:t>5.39%</w:t>
             </w:r>
           </w:p>
         </w:tc>
@@ -22496,7 +22775,7 @@
                 <w:color w:val="24313B"/>
                 <w:sz w:val="13"/>
               </w:rPr>
-              <w:t>33</w:t>
+              <w:t>38</w:t>
             </w:r>
           </w:p>
         </w:tc>
@@ -22523,7 +22802,7 @@
                 <w:color w:val="24313B"/>
                 <w:sz w:val="13"/>
               </w:rPr>
-              <w:t>188</w:t>
+              <w:t>187</w:t>
             </w:r>
           </w:p>
         </w:tc>
@@ -22577,7 +22856,7 @@
                 <w:color w:val="24313B"/>
                 <w:sz w:val="13"/>
               </w:rPr>
-              <w:t>294,023.99</w:t>
+              <w:t>294,029.49</w:t>
             </w:r>
           </w:p>
         </w:tc>
@@ -22604,7 +22883,7 @@
                 <w:color w:val="24313B"/>
                 <w:sz w:val="13"/>
               </w:rPr>
-              <w:t>35,472.53</w:t>
+              <w:t>294,284.65</w:t>
             </w:r>
           </w:p>
         </w:tc>
@@ -22687,7 +22966,7 @@
                 <w:color w:val="24313B"/>
                 <w:sz w:val="13"/>
               </w:rPr>
-              <w:t>4,923.80</w:t>
+              <w:t>5,667.85</w:t>
             </w:r>
           </w:p>
         </w:tc>
@@ -22713,7 +22992,7 @@
                 <w:color w:val="24313B"/>
                 <w:sz w:val="13"/>
               </w:rPr>
-              <w:t>10.94%</w:t>
+              <w:t>12.60%</w:t>
             </w:r>
           </w:p>
         </w:tc>
@@ -22739,7 +23018,7 @@
                 <w:color w:val="24313B"/>
                 <w:sz w:val="13"/>
               </w:rPr>
-              <w:t>28</w:t>
+              <w:t>35</w:t>
             </w:r>
           </w:p>
         </w:tc>
@@ -22765,7 +23044,7 @@
                 <w:color w:val="24313B"/>
                 <w:sz w:val="13"/>
               </w:rPr>
-              <w:t>185</w:t>
+              <w:t>245</w:t>
             </w:r>
           </w:p>
         </w:tc>
@@ -22817,7 +23096,7 @@
                 <w:color w:val="24313B"/>
                 <w:sz w:val="13"/>
               </w:rPr>
-              <w:t>136,900.88</w:t>
+              <w:t>136,899.11</w:t>
             </w:r>
           </w:p>
         </w:tc>
@@ -22843,7 +23122,7 @@
                 <w:color w:val="24313B"/>
                 <w:sz w:val="13"/>
               </w:rPr>
-              <w:t>15,932.16</w:t>
+              <w:t>137,147.14</w:t>
             </w:r>
           </w:p>
         </w:tc>
@@ -22929,7 +23208,7 @@
                 <w:color w:val="24313B"/>
                 <w:sz w:val="13"/>
               </w:rPr>
-              <w:t>152.01</w:t>
+              <w:t>282.85</w:t>
             </w:r>
           </w:p>
         </w:tc>
@@ -22956,7 +23235,7 @@
                 <w:color w:val="24313B"/>
                 <w:sz w:val="13"/>
               </w:rPr>
-              <w:t>1.69%</w:t>
+              <w:t>3.14%</w:t>
             </w:r>
           </w:p>
         </w:tc>
@@ -22983,7 +23262,7 @@
                 <w:color w:val="24313B"/>
                 <w:sz w:val="13"/>
               </w:rPr>
-              <w:t>67</w:t>
+              <w:t>123</w:t>
             </w:r>
           </w:p>
         </w:tc>
@@ -23010,7 +23289,7 @@
                 <w:color w:val="24313B"/>
                 <w:sz w:val="13"/>
               </w:rPr>
-              <w:t>118</w:t>
+              <w:t>30,001</w:t>
             </w:r>
           </w:p>
         </w:tc>
@@ -23037,7 +23316,7 @@
                 <w:color w:val="24313B"/>
                 <w:sz w:val="13"/>
               </w:rPr>
-              <w:t>466</w:t>
+              <w:t>30,001</w:t>
             </w:r>
           </w:p>
         </w:tc>
@@ -23064,7 +23343,7 @@
                 <w:color w:val="24313B"/>
                 <w:sz w:val="13"/>
               </w:rPr>
-              <w:t>430,898.05</w:t>
+              <w:t>430,910.02</w:t>
             </w:r>
           </w:p>
         </w:tc>
@@ -23091,7 +23370,7 @@
                 <w:color w:val="24313B"/>
                 <w:sz w:val="13"/>
               </w:rPr>
-              <w:t>51,153.89</w:t>
+              <w:t>431,152.66</w:t>
             </w:r>
           </w:p>
         </w:tc>
@@ -23174,7 +23453,7 @@
                 <w:color w:val="24313B"/>
                 <w:sz w:val="13"/>
               </w:rPr>
-              <w:t>10,136.75</w:t>
+              <w:t>11,767.22</w:t>
             </w:r>
           </w:p>
         </w:tc>
@@ -23200,7 +23479,7 @@
                 <w:color w:val="24313B"/>
                 <w:sz w:val="13"/>
               </w:rPr>
-              <w:t>5.63%</w:t>
+              <w:t>6.54%</w:t>
             </w:r>
           </w:p>
         </w:tc>
@@ -23304,7 +23583,7 @@
                 <w:color w:val="24313B"/>
                 <w:sz w:val="13"/>
               </w:rPr>
-              <w:t>—</w:t>
+              <w:t>143,203.11</w:t>
             </w:r>
           </w:p>
         </w:tc>
@@ -23416,7 +23695,7 @@
                 <w:color w:val="24313B"/>
                 <w:sz w:val="13"/>
               </w:rPr>
-              <w:t>29,847.15</w:t>
+              <w:t>29,001.74</w:t>
             </w:r>
           </w:p>
         </w:tc>
@@ -23443,7 +23722,7 @@
                 <w:color w:val="24313B"/>
                 <w:sz w:val="13"/>
               </w:rPr>
-              <w:t>99.49%</w:t>
+              <w:t>96.67%</w:t>
             </w:r>
           </w:p>
         </w:tc>
@@ -23470,7 +23749,7 @@
                 <w:color w:val="24313B"/>
                 <w:sz w:val="13"/>
               </w:rPr>
-              <w:t>33</w:t>
+              <w:t>32</w:t>
             </w:r>
           </w:p>
         </w:tc>
@@ -23497,7 +23776,7 @@
                 <w:color w:val="24313B"/>
                 <w:sz w:val="13"/>
               </w:rPr>
-              <w:t>356</w:t>
+              <w:t>548</w:t>
             </w:r>
           </w:p>
         </w:tc>
@@ -23524,7 +23803,7 @@
                 <w:color w:val="24313B"/>
                 <w:sz w:val="13"/>
               </w:rPr>
-              <w:t>635</w:t>
+              <w:t>2,182</w:t>
             </w:r>
           </w:p>
         </w:tc>
@@ -23592,7 +23871,7 @@
         <w:rPr>
           <w:b w:val="0"/>
         </w:rPr>
-        <w:t>Read latency histograms include successful responses, fast HTTP 429 responses, and request failures; they are not success-only service latencies at this overload level. A 30,001 ms value is the 30-second wall-clock timeout sentinel.</w:t>
+        <w:t>HTTP latency histograms include successful responses, fast HTTP 429 responses, and request failures; they are not success-only service latencies at this overload level. A 30,001 ms value is the 30-second wall-clock timeout sentinel. The new redis_ms histograms below include successful responses only and isolate Redis command time from API queuing and response delivery.</w:t>
       </w:r>
     </w:p>
     <w:p>
@@ -23603,7 +23882,1893 @@
         <w:rPr>
           <w:b w:val="0"/>
         </w:rPr>
-        <w:t>The query generators recorded 608,206 successful reads during the measurement window, 7,544,659 HTTP 429 responses, 2,296,563 unscheduled drops, and 345,915 timeouts. The write generators inserted 1,795,797 unique transactions, dropped 4,203 write slots, and reported zero errors. The immediately preceding attempt is excluded because its write generators started before restored account samples were visible; this recorded rerun verified all 6,600 accounts and complete 1,000-account sample pools.</w:t>
+        <w:t>The query generators recorded 706,033 successful reads during the measurement window, 6,716,293 HTTP 429 responses, 2,989,529 unscheduled drops, and 383,133 timeouts. The write generators inserted 1,740,104 unique transactions during the measurement window, dropped 49,881 write slots, and reported zero errors.</w:t>
+      </w:r>
+    </w:p>
+    <w:p>
+      <w:pPr>
+        <w:keepNext/>
+        <w:spacing w:after="60"/>
+      </w:pPr>
+      <w:r>
+        <w:rPr>
+          <w:rFonts w:ascii="Arial" w:hAnsi="Arial" w:eastAsia="Arial"/>
+          <w:b/>
+          <w:color w:val="16324F"/>
+          <w:sz w:val="18"/>
+        </w:rPr>
+        <w:t>Successful-response Redis timing</w:t>
+      </w:r>
+      <w:r>
+        <w:rPr>
+          <w:rFonts w:ascii="Arial" w:hAnsi="Arial" w:eastAsia="Arial"/>
+          <w:color w:val="16324F"/>
+          <w:sz w:val="18"/>
+        </w:rPr>
+      </w:r>
+    </w:p>
+    <w:tbl>
+      <w:tblPr>
+        <w:tblW w:type="auto" w:w="0"/>
+        <w:jc w:val="center"/>
+        <w:tblLayout w:type="fixed"/>
+        <w:tblLook w:firstColumn="1" w:firstRow="1" w:lastColumn="0" w:lastRow="0" w:noHBand="0" w:noVBand="1" w:val="04A0"/>
+        <w:tblBorders>
+          <w:top w:val="single" w:sz="6" w:color="C8D4DA"/>
+          <w:left w:val="single" w:sz="6" w:color="C8D4DA"/>
+          <w:bottom w:val="single" w:sz="6" w:color="C8D4DA"/>
+          <w:right w:val="single" w:sz="6" w:color="C8D4DA"/>
+          <w:insideH w:val="single" w:sz="6" w:color="C8D4DA"/>
+          <w:insideV w:val="single" w:sz="6" w:color="C8D4DA"/>
+        </w:tblBorders>
+      </w:tblPr>
+      <w:tblGrid>
+        <w:gridCol w:w="2033"/>
+        <w:gridCol w:w="2033"/>
+        <w:gridCol w:w="2033"/>
+        <w:gridCol w:w="2033"/>
+        <w:gridCol w:w="2033"/>
+      </w:tblGrid>
+      <w:tr>
+        <w:trPr>
+          <w:tblHeader w:val="true"/>
+          <w:cantSplit/>
+        </w:trPr>
+        <w:tc>
+          <w:tcPr>
+            <w:tcW w:type="dxa" w:w="3240"/>
+            <w:shd w:fill="2A7F9E"/>
+            <w:tcMar>
+              <w:top w:w="90" w:type="dxa"/>
+              <w:start w:w="80" w:type="dxa"/>
+              <w:bottom w:w="90" w:type="dxa"/>
+              <w:end w:w="80" w:type="dxa"/>
+            </w:tcMar>
+            <w:vAlign w:val="center"/>
+          </w:tcPr>
+          <w:p>
+            <w:pPr>
+              <w:spacing w:after="0"/>
+              <w:jc w:val="left"/>
+            </w:pPr>
+            <w:r>
+              <w:rPr>
+                <w:rFonts w:ascii="Arial" w:hAnsi="Arial" w:eastAsia="Arial"/>
+                <w:b/>
+                <w:color w:val="FFFFFF"/>
+                <w:sz w:val="14"/>
+              </w:rPr>
+              <w:t>Pattern</w:t>
+            </w:r>
+          </w:p>
+        </w:tc>
+        <w:tc>
+          <w:tcPr>
+            <w:tcW w:type="dxa" w:w="1512"/>
+            <w:shd w:fill="2A7F9E"/>
+            <w:tcMar>
+              <w:top w:w="90" w:type="dxa"/>
+              <w:start w:w="80" w:type="dxa"/>
+              <w:bottom w:w="90" w:type="dxa"/>
+              <w:end w:w="80" w:type="dxa"/>
+            </w:tcMar>
+            <w:vAlign w:val="center"/>
+          </w:tcPr>
+          <w:p>
+            <w:pPr>
+              <w:spacing w:after="0"/>
+              <w:jc w:val="right"/>
+            </w:pPr>
+            <w:r>
+              <w:rPr>
+                <w:rFonts w:ascii="Arial" w:hAnsi="Arial" w:eastAsia="Arial"/>
+                <w:b/>
+                <w:color w:val="FFFFFF"/>
+                <w:sz w:val="14"/>
+              </w:rPr>
+              <w:t>Samples</w:t>
+            </w:r>
+          </w:p>
+        </w:tc>
+        <w:tc>
+          <w:tcPr>
+            <w:tcW w:type="dxa" w:w="1512"/>
+            <w:shd w:fill="2A7F9E"/>
+            <w:tcMar>
+              <w:top w:w="90" w:type="dxa"/>
+              <w:start w:w="80" w:type="dxa"/>
+              <w:bottom w:w="90" w:type="dxa"/>
+              <w:end w:w="80" w:type="dxa"/>
+            </w:tcMar>
+            <w:vAlign w:val="center"/>
+          </w:tcPr>
+          <w:p>
+            <w:pPr>
+              <w:spacing w:after="0"/>
+              <w:jc w:val="right"/>
+            </w:pPr>
+            <w:r>
+              <w:rPr>
+                <w:rFonts w:ascii="Arial" w:hAnsi="Arial" w:eastAsia="Arial"/>
+                <w:b/>
+                <w:color w:val="FFFFFF"/>
+                <w:sz w:val="14"/>
+              </w:rPr>
+              <w:t>Redis p50 ms</w:t>
+            </w:r>
+          </w:p>
+        </w:tc>
+        <w:tc>
+          <w:tcPr>
+            <w:tcW w:type="dxa" w:w="1512"/>
+            <w:shd w:fill="2A7F9E"/>
+            <w:tcMar>
+              <w:top w:w="90" w:type="dxa"/>
+              <w:start w:w="80" w:type="dxa"/>
+              <w:bottom w:w="90" w:type="dxa"/>
+              <w:end w:w="80" w:type="dxa"/>
+            </w:tcMar>
+            <w:vAlign w:val="center"/>
+          </w:tcPr>
+          <w:p>
+            <w:pPr>
+              <w:spacing w:after="0"/>
+              <w:jc w:val="right"/>
+            </w:pPr>
+            <w:r>
+              <w:rPr>
+                <w:rFonts w:ascii="Arial" w:hAnsi="Arial" w:eastAsia="Arial"/>
+                <w:b/>
+                <w:color w:val="FFFFFF"/>
+                <w:sz w:val="14"/>
+              </w:rPr>
+              <w:t>Redis p95 ms</w:t>
+            </w:r>
+          </w:p>
+        </w:tc>
+        <w:tc>
+          <w:tcPr>
+            <w:tcW w:type="dxa" w:w="1512"/>
+            <w:shd w:fill="2A7F9E"/>
+            <w:tcMar>
+              <w:top w:w="90" w:type="dxa"/>
+              <w:start w:w="80" w:type="dxa"/>
+              <w:bottom w:w="90" w:type="dxa"/>
+              <w:end w:w="80" w:type="dxa"/>
+            </w:tcMar>
+            <w:vAlign w:val="center"/>
+          </w:tcPr>
+          <w:p>
+            <w:pPr>
+              <w:spacing w:after="0"/>
+              <w:jc w:val="right"/>
+            </w:pPr>
+            <w:r>
+              <w:rPr>
+                <w:rFonts w:ascii="Arial" w:hAnsi="Arial" w:eastAsia="Arial"/>
+                <w:b/>
+                <w:color w:val="FFFFFF"/>
+                <w:sz w:val="14"/>
+              </w:rPr>
+              <w:t>Redis p99 ms</w:t>
+            </w:r>
+          </w:p>
+        </w:tc>
+      </w:tr>
+      <w:tr>
+        <w:trPr>
+          <w:cantSplit/>
+        </w:trPr>
+        <w:tc>
+          <w:tcPr>
+            <w:tcW w:type="dxa" w:w="3240"/>
+            <w:tcMar>
+              <w:top w:w="75" w:type="dxa"/>
+              <w:start w:w="75" w:type="dxa"/>
+              <w:bottom w:w="75" w:type="dxa"/>
+              <w:end w:w="75" w:type="dxa"/>
+            </w:tcMar>
+            <w:vAlign w:val="center"/>
+          </w:tcPr>
+          <w:p>
+            <w:pPr>
+              <w:spacing w:after="0"/>
+              <w:jc w:val="left"/>
+            </w:pPr>
+            <w:r>
+              <w:rPr>
+                <w:rFonts w:ascii="Arial" w:hAnsi="Arial" w:eastAsia="Arial"/>
+                <w:color w:val="24313B"/>
+                <w:sz w:val="14"/>
+              </w:rPr>
+              <w:t>accountById</w:t>
+            </w:r>
+          </w:p>
+        </w:tc>
+        <w:tc>
+          <w:tcPr>
+            <w:tcW w:type="dxa" w:w="1512"/>
+            <w:tcMar>
+              <w:top w:w="75" w:type="dxa"/>
+              <w:start w:w="75" w:type="dxa"/>
+              <w:bottom w:w="75" w:type="dxa"/>
+              <w:end w:w="75" w:type="dxa"/>
+            </w:tcMar>
+            <w:vAlign w:val="center"/>
+          </w:tcPr>
+          <w:p>
+            <w:pPr>
+              <w:spacing w:after="0"/>
+              <w:jc w:val="right"/>
+            </w:pPr>
+            <w:r>
+              <w:rPr>
+                <w:rFonts w:ascii="Arial" w:hAnsi="Arial" w:eastAsia="Arial"/>
+                <w:color w:val="24313B"/>
+                <w:sz w:val="14"/>
+              </w:rPr>
+              <w:t>22,886</w:t>
+            </w:r>
+          </w:p>
+        </w:tc>
+        <w:tc>
+          <w:tcPr>
+            <w:tcW w:type="dxa" w:w="1512"/>
+            <w:tcMar>
+              <w:top w:w="75" w:type="dxa"/>
+              <w:start w:w="75" w:type="dxa"/>
+              <w:bottom w:w="75" w:type="dxa"/>
+              <w:end w:w="75" w:type="dxa"/>
+            </w:tcMar>
+            <w:vAlign w:val="center"/>
+          </w:tcPr>
+          <w:p>
+            <w:pPr>
+              <w:spacing w:after="0"/>
+              <w:jc w:val="right"/>
+            </w:pPr>
+            <w:r>
+              <w:rPr>
+                <w:rFonts w:ascii="Arial" w:hAnsi="Arial" w:eastAsia="Arial"/>
+                <w:color w:val="24313B"/>
+                <w:sz w:val="14"/>
+              </w:rPr>
+              <w:t>213</w:t>
+            </w:r>
+          </w:p>
+        </w:tc>
+        <w:tc>
+          <w:tcPr>
+            <w:tcW w:type="dxa" w:w="1512"/>
+            <w:tcMar>
+              <w:top w:w="75" w:type="dxa"/>
+              <w:start w:w="75" w:type="dxa"/>
+              <w:bottom w:w="75" w:type="dxa"/>
+              <w:end w:w="75" w:type="dxa"/>
+            </w:tcMar>
+            <w:vAlign w:val="center"/>
+          </w:tcPr>
+          <w:p>
+            <w:pPr>
+              <w:spacing w:after="0"/>
+              <w:jc w:val="right"/>
+            </w:pPr>
+            <w:r>
+              <w:rPr>
+                <w:rFonts w:ascii="Arial" w:hAnsi="Arial" w:eastAsia="Arial"/>
+                <w:color w:val="24313B"/>
+                <w:sz w:val="14"/>
+              </w:rPr>
+              <w:t>502</w:t>
+            </w:r>
+          </w:p>
+        </w:tc>
+        <w:tc>
+          <w:tcPr>
+            <w:tcW w:type="dxa" w:w="1512"/>
+            <w:tcMar>
+              <w:top w:w="75" w:type="dxa"/>
+              <w:start w:w="75" w:type="dxa"/>
+              <w:bottom w:w="75" w:type="dxa"/>
+              <w:end w:w="75" w:type="dxa"/>
+            </w:tcMar>
+            <w:vAlign w:val="center"/>
+          </w:tcPr>
+          <w:p>
+            <w:pPr>
+              <w:spacing w:after="0"/>
+              <w:jc w:val="right"/>
+            </w:pPr>
+            <w:r>
+              <w:rPr>
+                <w:rFonts w:ascii="Arial" w:hAnsi="Arial" w:eastAsia="Arial"/>
+                <w:color w:val="24313B"/>
+                <w:sz w:val="14"/>
+              </w:rPr>
+              <w:t>1,745</w:t>
+            </w:r>
+          </w:p>
+        </w:tc>
+      </w:tr>
+      <w:tr>
+        <w:trPr>
+          <w:cantSplit/>
+        </w:trPr>
+        <w:tc>
+          <w:tcPr>
+            <w:tcW w:type="dxa" w:w="3240"/>
+            <w:shd w:fill="F2F6F8"/>
+            <w:tcMar>
+              <w:top w:w="75" w:type="dxa"/>
+              <w:start w:w="75" w:type="dxa"/>
+              <w:bottom w:w="75" w:type="dxa"/>
+              <w:end w:w="75" w:type="dxa"/>
+            </w:tcMar>
+            <w:vAlign w:val="center"/>
+          </w:tcPr>
+          <w:p>
+            <w:pPr>
+              <w:spacing w:after="0"/>
+              <w:jc w:val="left"/>
+            </w:pPr>
+            <w:r>
+              <w:rPr>
+                <w:rFonts w:ascii="Arial" w:hAnsi="Arial" w:eastAsia="Arial"/>
+                <w:color w:val="24313B"/>
+                <w:sz w:val="14"/>
+              </w:rPr>
+              <w:t>securityById</w:t>
+            </w:r>
+          </w:p>
+        </w:tc>
+        <w:tc>
+          <w:tcPr>
+            <w:tcW w:type="dxa" w:w="1512"/>
+            <w:shd w:fill="F2F6F8"/>
+            <w:tcMar>
+              <w:top w:w="75" w:type="dxa"/>
+              <w:start w:w="75" w:type="dxa"/>
+              <w:bottom w:w="75" w:type="dxa"/>
+              <w:end w:w="75" w:type="dxa"/>
+            </w:tcMar>
+            <w:vAlign w:val="center"/>
+          </w:tcPr>
+          <w:p>
+            <w:pPr>
+              <w:spacing w:after="0"/>
+              <w:jc w:val="right"/>
+            </w:pPr>
+            <w:r>
+              <w:rPr>
+                <w:rFonts w:ascii="Arial" w:hAnsi="Arial" w:eastAsia="Arial"/>
+                <w:color w:val="24313B"/>
+                <w:sz w:val="14"/>
+              </w:rPr>
+              <w:t>24,992</w:t>
+            </w:r>
+          </w:p>
+        </w:tc>
+        <w:tc>
+          <w:tcPr>
+            <w:tcW w:type="dxa" w:w="1512"/>
+            <w:shd w:fill="F2F6F8"/>
+            <w:tcMar>
+              <w:top w:w="75" w:type="dxa"/>
+              <w:start w:w="75" w:type="dxa"/>
+              <w:bottom w:w="75" w:type="dxa"/>
+              <w:end w:w="75" w:type="dxa"/>
+            </w:tcMar>
+            <w:vAlign w:val="center"/>
+          </w:tcPr>
+          <w:p>
+            <w:pPr>
+              <w:spacing w:after="0"/>
+              <w:jc w:val="right"/>
+            </w:pPr>
+            <w:r>
+              <w:rPr>
+                <w:rFonts w:ascii="Arial" w:hAnsi="Arial" w:eastAsia="Arial"/>
+                <w:color w:val="24313B"/>
+                <w:sz w:val="14"/>
+              </w:rPr>
+              <w:t>206</w:t>
+            </w:r>
+          </w:p>
+        </w:tc>
+        <w:tc>
+          <w:tcPr>
+            <w:tcW w:type="dxa" w:w="1512"/>
+            <w:shd w:fill="F2F6F8"/>
+            <w:tcMar>
+              <w:top w:w="75" w:type="dxa"/>
+              <w:start w:w="75" w:type="dxa"/>
+              <w:bottom w:w="75" w:type="dxa"/>
+              <w:end w:w="75" w:type="dxa"/>
+            </w:tcMar>
+            <w:vAlign w:val="center"/>
+          </w:tcPr>
+          <w:p>
+            <w:pPr>
+              <w:spacing w:after="0"/>
+              <w:jc w:val="right"/>
+            </w:pPr>
+            <w:r>
+              <w:rPr>
+                <w:rFonts w:ascii="Arial" w:hAnsi="Arial" w:eastAsia="Arial"/>
+                <w:color w:val="24313B"/>
+                <w:sz w:val="14"/>
+              </w:rPr>
+              <w:t>472</w:t>
+            </w:r>
+          </w:p>
+        </w:tc>
+        <w:tc>
+          <w:tcPr>
+            <w:tcW w:type="dxa" w:w="1512"/>
+            <w:shd w:fill="F2F6F8"/>
+            <w:tcMar>
+              <w:top w:w="75" w:type="dxa"/>
+              <w:start w:w="75" w:type="dxa"/>
+              <w:bottom w:w="75" w:type="dxa"/>
+              <w:end w:w="75" w:type="dxa"/>
+            </w:tcMar>
+            <w:vAlign w:val="center"/>
+          </w:tcPr>
+          <w:p>
+            <w:pPr>
+              <w:spacing w:after="0"/>
+              <w:jc w:val="right"/>
+            </w:pPr>
+            <w:r>
+              <w:rPr>
+                <w:rFonts w:ascii="Arial" w:hAnsi="Arial" w:eastAsia="Arial"/>
+                <w:color w:val="24313B"/>
+                <w:sz w:val="14"/>
+              </w:rPr>
+              <w:t>1,734</w:t>
+            </w:r>
+          </w:p>
+        </w:tc>
+      </w:tr>
+      <w:tr>
+        <w:trPr>
+          <w:cantSplit/>
+        </w:trPr>
+        <w:tc>
+          <w:tcPr>
+            <w:tcW w:type="dxa" w:w="3240"/>
+            <w:tcMar>
+              <w:top w:w="75" w:type="dxa"/>
+              <w:start w:w="75" w:type="dxa"/>
+              <w:bottom w:w="75" w:type="dxa"/>
+              <w:end w:w="75" w:type="dxa"/>
+            </w:tcMar>
+            <w:vAlign w:val="center"/>
+          </w:tcPr>
+          <w:p>
+            <w:pPr>
+              <w:spacing w:after="0"/>
+              <w:jc w:val="left"/>
+            </w:pPr>
+            <w:r>
+              <w:rPr>
+                <w:rFonts w:ascii="Arial" w:hAnsi="Arial" w:eastAsia="Arial"/>
+                <w:color w:val="24313B"/>
+                <w:sz w:val="14"/>
+              </w:rPr>
+              <w:t>securityByNo</w:t>
+            </w:r>
+          </w:p>
+        </w:tc>
+        <w:tc>
+          <w:tcPr>
+            <w:tcW w:type="dxa" w:w="1512"/>
+            <w:tcMar>
+              <w:top w:w="75" w:type="dxa"/>
+              <w:start w:w="75" w:type="dxa"/>
+              <w:bottom w:w="75" w:type="dxa"/>
+              <w:end w:w="75" w:type="dxa"/>
+            </w:tcMar>
+            <w:vAlign w:val="center"/>
+          </w:tcPr>
+          <w:p>
+            <w:pPr>
+              <w:spacing w:after="0"/>
+              <w:jc w:val="right"/>
+            </w:pPr>
+            <w:r>
+              <w:rPr>
+                <w:rFonts w:ascii="Arial" w:hAnsi="Arial" w:eastAsia="Arial"/>
+                <w:color w:val="24313B"/>
+                <w:sz w:val="14"/>
+              </w:rPr>
+              <w:t>20,343</w:t>
+            </w:r>
+          </w:p>
+        </w:tc>
+        <w:tc>
+          <w:tcPr>
+            <w:tcW w:type="dxa" w:w="1512"/>
+            <w:tcMar>
+              <w:top w:w="75" w:type="dxa"/>
+              <w:start w:w="75" w:type="dxa"/>
+              <w:bottom w:w="75" w:type="dxa"/>
+              <w:end w:w="75" w:type="dxa"/>
+            </w:tcMar>
+            <w:vAlign w:val="center"/>
+          </w:tcPr>
+          <w:p>
+            <w:pPr>
+              <w:spacing w:after="0"/>
+              <w:jc w:val="right"/>
+            </w:pPr>
+            <w:r>
+              <w:rPr>
+                <w:rFonts w:ascii="Arial" w:hAnsi="Arial" w:eastAsia="Arial"/>
+                <w:color w:val="24313B"/>
+                <w:sz w:val="14"/>
+              </w:rPr>
+              <w:t>636</w:t>
+            </w:r>
+          </w:p>
+        </w:tc>
+        <w:tc>
+          <w:tcPr>
+            <w:tcW w:type="dxa" w:w="1512"/>
+            <w:tcMar>
+              <w:top w:w="75" w:type="dxa"/>
+              <w:start w:w="75" w:type="dxa"/>
+              <w:bottom w:w="75" w:type="dxa"/>
+              <w:end w:w="75" w:type="dxa"/>
+            </w:tcMar>
+            <w:vAlign w:val="center"/>
+          </w:tcPr>
+          <w:p>
+            <w:pPr>
+              <w:spacing w:after="0"/>
+              <w:jc w:val="right"/>
+            </w:pPr>
+            <w:r>
+              <w:rPr>
+                <w:rFonts w:ascii="Arial" w:hAnsi="Arial" w:eastAsia="Arial"/>
+                <w:color w:val="24313B"/>
+                <w:sz w:val="14"/>
+              </w:rPr>
+              <w:t>2,188</w:t>
+            </w:r>
+          </w:p>
+        </w:tc>
+        <w:tc>
+          <w:tcPr>
+            <w:tcW w:type="dxa" w:w="1512"/>
+            <w:tcMar>
+              <w:top w:w="75" w:type="dxa"/>
+              <w:start w:w="75" w:type="dxa"/>
+              <w:bottom w:w="75" w:type="dxa"/>
+              <w:end w:w="75" w:type="dxa"/>
+            </w:tcMar>
+            <w:vAlign w:val="center"/>
+          </w:tcPr>
+          <w:p>
+            <w:pPr>
+              <w:spacing w:after="0"/>
+              <w:jc w:val="right"/>
+            </w:pPr>
+            <w:r>
+              <w:rPr>
+                <w:rFonts w:ascii="Arial" w:hAnsi="Arial" w:eastAsia="Arial"/>
+                <w:color w:val="24313B"/>
+                <w:sz w:val="14"/>
+              </w:rPr>
+              <w:t>4,629</w:t>
+            </w:r>
+          </w:p>
+        </w:tc>
+      </w:tr>
+      <w:tr>
+        <w:trPr>
+          <w:cantSplit/>
+        </w:trPr>
+        <w:tc>
+          <w:tcPr>
+            <w:tcW w:type="dxa" w:w="3240"/>
+            <w:shd w:fill="F2F6F8"/>
+            <w:tcMar>
+              <w:top w:w="75" w:type="dxa"/>
+              <w:start w:w="75" w:type="dxa"/>
+              <w:bottom w:w="75" w:type="dxa"/>
+              <w:end w:w="75" w:type="dxa"/>
+            </w:tcMar>
+            <w:vAlign w:val="center"/>
+          </w:tcPr>
+          <w:p>
+            <w:pPr>
+              <w:spacing w:after="0"/>
+              <w:jc w:val="left"/>
+            </w:pPr>
+            <w:r>
+              <w:rPr>
+                <w:rFonts w:ascii="Arial" w:hAnsi="Arial" w:eastAsia="Arial"/>
+                <w:color w:val="24313B"/>
+                <w:sz w:val="14"/>
+              </w:rPr>
+              <w:t>positionByComposite</w:t>
+            </w:r>
+          </w:p>
+        </w:tc>
+        <w:tc>
+          <w:tcPr>
+            <w:tcW w:type="dxa" w:w="1512"/>
+            <w:shd w:fill="F2F6F8"/>
+            <w:tcMar>
+              <w:top w:w="75" w:type="dxa"/>
+              <w:start w:w="75" w:type="dxa"/>
+              <w:bottom w:w="75" w:type="dxa"/>
+              <w:end w:w="75" w:type="dxa"/>
+            </w:tcMar>
+            <w:vAlign w:val="center"/>
+          </w:tcPr>
+          <w:p>
+            <w:pPr>
+              <w:spacing w:after="0"/>
+              <w:jc w:val="right"/>
+            </w:pPr>
+            <w:r>
+              <w:rPr>
+                <w:rFonts w:ascii="Arial" w:hAnsi="Arial" w:eastAsia="Arial"/>
+                <w:color w:val="24313B"/>
+                <w:sz w:val="14"/>
+              </w:rPr>
+              <w:t>28,218</w:t>
+            </w:r>
+          </w:p>
+        </w:tc>
+        <w:tc>
+          <w:tcPr>
+            <w:tcW w:type="dxa" w:w="1512"/>
+            <w:shd w:fill="F2F6F8"/>
+            <w:tcMar>
+              <w:top w:w="75" w:type="dxa"/>
+              <w:start w:w="75" w:type="dxa"/>
+              <w:bottom w:w="75" w:type="dxa"/>
+              <w:end w:w="75" w:type="dxa"/>
+            </w:tcMar>
+            <w:vAlign w:val="center"/>
+          </w:tcPr>
+          <w:p>
+            <w:pPr>
+              <w:spacing w:after="0"/>
+              <w:jc w:val="right"/>
+            </w:pPr>
+            <w:r>
+              <w:rPr>
+                <w:rFonts w:ascii="Arial" w:hAnsi="Arial" w:eastAsia="Arial"/>
+                <w:color w:val="24313B"/>
+                <w:sz w:val="14"/>
+              </w:rPr>
+              <w:t>203</w:t>
+            </w:r>
+          </w:p>
+        </w:tc>
+        <w:tc>
+          <w:tcPr>
+            <w:tcW w:type="dxa" w:w="1512"/>
+            <w:shd w:fill="F2F6F8"/>
+            <w:tcMar>
+              <w:top w:w="75" w:type="dxa"/>
+              <w:start w:w="75" w:type="dxa"/>
+              <w:bottom w:w="75" w:type="dxa"/>
+              <w:end w:w="75" w:type="dxa"/>
+            </w:tcMar>
+            <w:vAlign w:val="center"/>
+          </w:tcPr>
+          <w:p>
+            <w:pPr>
+              <w:spacing w:after="0"/>
+              <w:jc w:val="right"/>
+            </w:pPr>
+            <w:r>
+              <w:rPr>
+                <w:rFonts w:ascii="Arial" w:hAnsi="Arial" w:eastAsia="Arial"/>
+                <w:color w:val="24313B"/>
+                <w:sz w:val="14"/>
+              </w:rPr>
+              <w:t>513</w:t>
+            </w:r>
+          </w:p>
+        </w:tc>
+        <w:tc>
+          <w:tcPr>
+            <w:tcW w:type="dxa" w:w="1512"/>
+            <w:shd w:fill="F2F6F8"/>
+            <w:tcMar>
+              <w:top w:w="75" w:type="dxa"/>
+              <w:start w:w="75" w:type="dxa"/>
+              <w:bottom w:w="75" w:type="dxa"/>
+              <w:end w:w="75" w:type="dxa"/>
+            </w:tcMar>
+            <w:vAlign w:val="center"/>
+          </w:tcPr>
+          <w:p>
+            <w:pPr>
+              <w:spacing w:after="0"/>
+              <w:jc w:val="right"/>
+            </w:pPr>
+            <w:r>
+              <w:rPr>
+                <w:rFonts w:ascii="Arial" w:hAnsi="Arial" w:eastAsia="Arial"/>
+                <w:color w:val="24313B"/>
+                <w:sz w:val="14"/>
+              </w:rPr>
+              <w:t>1,304</w:t>
+            </w:r>
+          </w:p>
+        </w:tc>
+      </w:tr>
+      <w:tr>
+        <w:trPr>
+          <w:cantSplit/>
+        </w:trPr>
+        <w:tc>
+          <w:tcPr>
+            <w:tcW w:type="dxa" w:w="3240"/>
+            <w:tcMar>
+              <w:top w:w="75" w:type="dxa"/>
+              <w:start w:w="75" w:type="dxa"/>
+              <w:bottom w:w="75" w:type="dxa"/>
+              <w:end w:w="75" w:type="dxa"/>
+            </w:tcMar>
+            <w:vAlign w:val="center"/>
+          </w:tcPr>
+          <w:p>
+            <w:pPr>
+              <w:spacing w:after="0"/>
+              <w:jc w:val="left"/>
+            </w:pPr>
+            <w:r>
+              <w:rPr>
+                <w:rFonts w:ascii="Arial" w:hAnsi="Arial" w:eastAsia="Arial"/>
+                <w:color w:val="24313B"/>
+                <w:sz w:val="14"/>
+              </w:rPr>
+              <w:t>positionsByAccount</w:t>
+            </w:r>
+          </w:p>
+        </w:tc>
+        <w:tc>
+          <w:tcPr>
+            <w:tcW w:type="dxa" w:w="1512"/>
+            <w:tcMar>
+              <w:top w:w="75" w:type="dxa"/>
+              <w:start w:w="75" w:type="dxa"/>
+              <w:bottom w:w="75" w:type="dxa"/>
+              <w:end w:w="75" w:type="dxa"/>
+            </w:tcMar>
+            <w:vAlign w:val="center"/>
+          </w:tcPr>
+          <w:p>
+            <w:pPr>
+              <w:spacing w:after="0"/>
+              <w:jc w:val="right"/>
+            </w:pPr>
+            <w:r>
+              <w:rPr>
+                <w:rFonts w:ascii="Arial" w:hAnsi="Arial" w:eastAsia="Arial"/>
+                <w:color w:val="24313B"/>
+                <w:sz w:val="14"/>
+              </w:rPr>
+              <w:t>20,939</w:t>
+            </w:r>
+          </w:p>
+        </w:tc>
+        <w:tc>
+          <w:tcPr>
+            <w:tcW w:type="dxa" w:w="1512"/>
+            <w:tcMar>
+              <w:top w:w="75" w:type="dxa"/>
+              <w:start w:w="75" w:type="dxa"/>
+              <w:bottom w:w="75" w:type="dxa"/>
+              <w:end w:w="75" w:type="dxa"/>
+            </w:tcMar>
+            <w:vAlign w:val="center"/>
+          </w:tcPr>
+          <w:p>
+            <w:pPr>
+              <w:spacing w:after="0"/>
+              <w:jc w:val="right"/>
+            </w:pPr>
+            <w:r>
+              <w:rPr>
+                <w:rFonts w:ascii="Arial" w:hAnsi="Arial" w:eastAsia="Arial"/>
+                <w:color w:val="24313B"/>
+                <w:sz w:val="14"/>
+              </w:rPr>
+              <w:t>171</w:t>
+            </w:r>
+          </w:p>
+        </w:tc>
+        <w:tc>
+          <w:tcPr>
+            <w:tcW w:type="dxa" w:w="1512"/>
+            <w:tcMar>
+              <w:top w:w="75" w:type="dxa"/>
+              <w:start w:w="75" w:type="dxa"/>
+              <w:bottom w:w="75" w:type="dxa"/>
+              <w:end w:w="75" w:type="dxa"/>
+            </w:tcMar>
+            <w:vAlign w:val="center"/>
+          </w:tcPr>
+          <w:p>
+            <w:pPr>
+              <w:spacing w:after="0"/>
+              <w:jc w:val="right"/>
+            </w:pPr>
+            <w:r>
+              <w:rPr>
+                <w:rFonts w:ascii="Arial" w:hAnsi="Arial" w:eastAsia="Arial"/>
+                <w:color w:val="24313B"/>
+                <w:sz w:val="14"/>
+              </w:rPr>
+              <w:t>257</w:t>
+            </w:r>
+          </w:p>
+        </w:tc>
+        <w:tc>
+          <w:tcPr>
+            <w:tcW w:type="dxa" w:w="1512"/>
+            <w:tcMar>
+              <w:top w:w="75" w:type="dxa"/>
+              <w:start w:w="75" w:type="dxa"/>
+              <w:bottom w:w="75" w:type="dxa"/>
+              <w:end w:w="75" w:type="dxa"/>
+            </w:tcMar>
+            <w:vAlign w:val="center"/>
+          </w:tcPr>
+          <w:p>
+            <w:pPr>
+              <w:spacing w:after="0"/>
+              <w:jc w:val="right"/>
+            </w:pPr>
+            <w:r>
+              <w:rPr>
+                <w:rFonts w:ascii="Arial" w:hAnsi="Arial" w:eastAsia="Arial"/>
+                <w:color w:val="24313B"/>
+                <w:sz w:val="14"/>
+              </w:rPr>
+              <w:t>883</w:t>
+            </w:r>
+          </w:p>
+        </w:tc>
+      </w:tr>
+      <w:tr>
+        <w:trPr>
+          <w:cantSplit/>
+        </w:trPr>
+        <w:tc>
+          <w:tcPr>
+            <w:tcW w:type="dxa" w:w="3240"/>
+            <w:shd w:fill="F2F6F8"/>
+            <w:tcMar>
+              <w:top w:w="75" w:type="dxa"/>
+              <w:start w:w="75" w:type="dxa"/>
+              <w:bottom w:w="75" w:type="dxa"/>
+              <w:end w:w="75" w:type="dxa"/>
+            </w:tcMar>
+            <w:vAlign w:val="center"/>
+          </w:tcPr>
+          <w:p>
+            <w:pPr>
+              <w:spacing w:after="0"/>
+              <w:jc w:val="left"/>
+            </w:pPr>
+            <w:r>
+              <w:rPr>
+                <w:rFonts w:ascii="Arial" w:hAnsi="Arial" w:eastAsia="Arial"/>
+                <w:color w:val="24313B"/>
+                <w:sz w:val="14"/>
+              </w:rPr>
+              <w:t>transactionById</w:t>
+            </w:r>
+          </w:p>
+        </w:tc>
+        <w:tc>
+          <w:tcPr>
+            <w:tcW w:type="dxa" w:w="1512"/>
+            <w:shd w:fill="F2F6F8"/>
+            <w:tcMar>
+              <w:top w:w="75" w:type="dxa"/>
+              <w:start w:w="75" w:type="dxa"/>
+              <w:bottom w:w="75" w:type="dxa"/>
+              <w:end w:w="75" w:type="dxa"/>
+            </w:tcMar>
+            <w:vAlign w:val="center"/>
+          </w:tcPr>
+          <w:p>
+            <w:pPr>
+              <w:spacing w:after="0"/>
+              <w:jc w:val="right"/>
+            </w:pPr>
+            <w:r>
+              <w:rPr>
+                <w:rFonts w:ascii="Arial" w:hAnsi="Arial" w:eastAsia="Arial"/>
+                <w:color w:val="24313B"/>
+                <w:sz w:val="14"/>
+              </w:rPr>
+              <w:t>26,787</w:t>
+            </w:r>
+          </w:p>
+        </w:tc>
+        <w:tc>
+          <w:tcPr>
+            <w:tcW w:type="dxa" w:w="1512"/>
+            <w:shd w:fill="F2F6F8"/>
+            <w:tcMar>
+              <w:top w:w="75" w:type="dxa"/>
+              <w:start w:w="75" w:type="dxa"/>
+              <w:bottom w:w="75" w:type="dxa"/>
+              <w:end w:w="75" w:type="dxa"/>
+            </w:tcMar>
+            <w:vAlign w:val="center"/>
+          </w:tcPr>
+          <w:p>
+            <w:pPr>
+              <w:spacing w:after="0"/>
+              <w:jc w:val="right"/>
+            </w:pPr>
+            <w:r>
+              <w:rPr>
+                <w:rFonts w:ascii="Arial" w:hAnsi="Arial" w:eastAsia="Arial"/>
+                <w:color w:val="24313B"/>
+                <w:sz w:val="14"/>
+              </w:rPr>
+              <w:t>206</w:t>
+            </w:r>
+          </w:p>
+        </w:tc>
+        <w:tc>
+          <w:tcPr>
+            <w:tcW w:type="dxa" w:w="1512"/>
+            <w:shd w:fill="F2F6F8"/>
+            <w:tcMar>
+              <w:top w:w="75" w:type="dxa"/>
+              <w:start w:w="75" w:type="dxa"/>
+              <w:bottom w:w="75" w:type="dxa"/>
+              <w:end w:w="75" w:type="dxa"/>
+            </w:tcMar>
+            <w:vAlign w:val="center"/>
+          </w:tcPr>
+          <w:p>
+            <w:pPr>
+              <w:spacing w:after="0"/>
+              <w:jc w:val="right"/>
+            </w:pPr>
+            <w:r>
+              <w:rPr>
+                <w:rFonts w:ascii="Arial" w:hAnsi="Arial" w:eastAsia="Arial"/>
+                <w:color w:val="24313B"/>
+                <w:sz w:val="14"/>
+              </w:rPr>
+              <w:t>506</w:t>
+            </w:r>
+          </w:p>
+        </w:tc>
+        <w:tc>
+          <w:tcPr>
+            <w:tcW w:type="dxa" w:w="1512"/>
+            <w:shd w:fill="F2F6F8"/>
+            <w:tcMar>
+              <w:top w:w="75" w:type="dxa"/>
+              <w:start w:w="75" w:type="dxa"/>
+              <w:bottom w:w="75" w:type="dxa"/>
+              <w:end w:w="75" w:type="dxa"/>
+            </w:tcMar>
+            <w:vAlign w:val="center"/>
+          </w:tcPr>
+          <w:p>
+            <w:pPr>
+              <w:spacing w:after="0"/>
+              <w:jc w:val="right"/>
+            </w:pPr>
+            <w:r>
+              <w:rPr>
+                <w:rFonts w:ascii="Arial" w:hAnsi="Arial" w:eastAsia="Arial"/>
+                <w:color w:val="24313B"/>
+                <w:sz w:val="14"/>
+              </w:rPr>
+              <w:t>1,494</w:t>
+            </w:r>
+          </w:p>
+        </w:tc>
+      </w:tr>
+      <w:tr>
+        <w:trPr>
+          <w:cantSplit/>
+        </w:trPr>
+        <w:tc>
+          <w:tcPr>
+            <w:tcW w:type="dxa" w:w="3240"/>
+            <w:tcMar>
+              <w:top w:w="75" w:type="dxa"/>
+              <w:start w:w="75" w:type="dxa"/>
+              <w:bottom w:w="75" w:type="dxa"/>
+              <w:end w:w="75" w:type="dxa"/>
+            </w:tcMar>
+            <w:vAlign w:val="center"/>
+          </w:tcPr>
+          <w:p>
+            <w:pPr>
+              <w:spacing w:after="0"/>
+              <w:jc w:val="left"/>
+            </w:pPr>
+            <w:r>
+              <w:rPr>
+                <w:rFonts w:ascii="Arial" w:hAnsi="Arial" w:eastAsia="Arial"/>
+                <w:color w:val="24313B"/>
+                <w:sz w:val="14"/>
+              </w:rPr>
+              <w:t>transactionsByAccount</w:t>
+            </w:r>
+          </w:p>
+        </w:tc>
+        <w:tc>
+          <w:tcPr>
+            <w:tcW w:type="dxa" w:w="1512"/>
+            <w:tcMar>
+              <w:top w:w="75" w:type="dxa"/>
+              <w:start w:w="75" w:type="dxa"/>
+              <w:bottom w:w="75" w:type="dxa"/>
+              <w:end w:w="75" w:type="dxa"/>
+            </w:tcMar>
+            <w:vAlign w:val="center"/>
+          </w:tcPr>
+          <w:p>
+            <w:pPr>
+              <w:spacing w:after="0"/>
+              <w:jc w:val="right"/>
+            </w:pPr>
+            <w:r>
+              <w:rPr>
+                <w:rFonts w:ascii="Arial" w:hAnsi="Arial" w:eastAsia="Arial"/>
+                <w:color w:val="24313B"/>
+                <w:sz w:val="14"/>
+              </w:rPr>
+              <w:t>20,625</w:t>
+            </w:r>
+          </w:p>
+        </w:tc>
+        <w:tc>
+          <w:tcPr>
+            <w:tcW w:type="dxa" w:w="1512"/>
+            <w:tcMar>
+              <w:top w:w="75" w:type="dxa"/>
+              <w:start w:w="75" w:type="dxa"/>
+              <w:bottom w:w="75" w:type="dxa"/>
+              <w:end w:w="75" w:type="dxa"/>
+            </w:tcMar>
+            <w:vAlign w:val="center"/>
+          </w:tcPr>
+          <w:p>
+            <w:pPr>
+              <w:spacing w:after="0"/>
+              <w:jc w:val="right"/>
+            </w:pPr>
+            <w:r>
+              <w:rPr>
+                <w:rFonts w:ascii="Arial" w:hAnsi="Arial" w:eastAsia="Arial"/>
+                <w:color w:val="24313B"/>
+                <w:sz w:val="14"/>
+              </w:rPr>
+              <w:t>28</w:t>
+            </w:r>
+          </w:p>
+        </w:tc>
+        <w:tc>
+          <w:tcPr>
+            <w:tcW w:type="dxa" w:w="1512"/>
+            <w:tcMar>
+              <w:top w:w="75" w:type="dxa"/>
+              <w:start w:w="75" w:type="dxa"/>
+              <w:bottom w:w="75" w:type="dxa"/>
+              <w:end w:w="75" w:type="dxa"/>
+            </w:tcMar>
+            <w:vAlign w:val="center"/>
+          </w:tcPr>
+          <w:p>
+            <w:pPr>
+              <w:spacing w:after="0"/>
+              <w:jc w:val="right"/>
+            </w:pPr>
+            <w:r>
+              <w:rPr>
+                <w:rFonts w:ascii="Arial" w:hAnsi="Arial" w:eastAsia="Arial"/>
+                <w:color w:val="24313B"/>
+                <w:sz w:val="14"/>
+              </w:rPr>
+              <w:t>284</w:t>
+            </w:r>
+          </w:p>
+        </w:tc>
+        <w:tc>
+          <w:tcPr>
+            <w:tcW w:type="dxa" w:w="1512"/>
+            <w:tcMar>
+              <w:top w:w="75" w:type="dxa"/>
+              <w:start w:w="75" w:type="dxa"/>
+              <w:bottom w:w="75" w:type="dxa"/>
+              <w:end w:w="75" w:type="dxa"/>
+            </w:tcMar>
+            <w:vAlign w:val="center"/>
+          </w:tcPr>
+          <w:p>
+            <w:pPr>
+              <w:spacing w:after="0"/>
+              <w:jc w:val="right"/>
+            </w:pPr>
+            <w:r>
+              <w:rPr>
+                <w:rFonts w:ascii="Arial" w:hAnsi="Arial" w:eastAsia="Arial"/>
+                <w:color w:val="24313B"/>
+                <w:sz w:val="14"/>
+              </w:rPr>
+              <w:t>1,924</w:t>
+            </w:r>
+          </w:p>
+        </w:tc>
+      </w:tr>
+      <w:tr>
+        <w:trPr>
+          <w:cantSplit/>
+        </w:trPr>
+        <w:tc>
+          <w:tcPr>
+            <w:tcW w:type="dxa" w:w="3240"/>
+            <w:shd w:fill="F2F6F8"/>
+            <w:tcMar>
+              <w:top w:w="75" w:type="dxa"/>
+              <w:start w:w="75" w:type="dxa"/>
+              <w:bottom w:w="75" w:type="dxa"/>
+              <w:end w:w="75" w:type="dxa"/>
+            </w:tcMar>
+            <w:vAlign w:val="center"/>
+          </w:tcPr>
+          <w:p>
+            <w:pPr>
+              <w:spacing w:after="0"/>
+              <w:jc w:val="left"/>
+            </w:pPr>
+            <w:r>
+              <w:rPr>
+                <w:rFonts w:ascii="Arial" w:hAnsi="Arial" w:eastAsia="Arial"/>
+                <w:color w:val="24313B"/>
+                <w:sz w:val="14"/>
+              </w:rPr>
+              <w:t>transactionsBySecurity</w:t>
+            </w:r>
+          </w:p>
+        </w:tc>
+        <w:tc>
+          <w:tcPr>
+            <w:tcW w:type="dxa" w:w="1512"/>
+            <w:shd w:fill="F2F6F8"/>
+            <w:tcMar>
+              <w:top w:w="75" w:type="dxa"/>
+              <w:start w:w="75" w:type="dxa"/>
+              <w:bottom w:w="75" w:type="dxa"/>
+              <w:end w:w="75" w:type="dxa"/>
+            </w:tcMar>
+            <w:vAlign w:val="center"/>
+          </w:tcPr>
+          <w:p>
+            <w:pPr>
+              <w:spacing w:after="0"/>
+              <w:jc w:val="right"/>
+            </w:pPr>
+            <w:r>
+              <w:rPr>
+                <w:rFonts w:ascii="Arial" w:hAnsi="Arial" w:eastAsia="Arial"/>
+                <w:color w:val="24313B"/>
+                <w:sz w:val="14"/>
+              </w:rPr>
+              <w:t>18,467</w:t>
+            </w:r>
+          </w:p>
+        </w:tc>
+        <w:tc>
+          <w:tcPr>
+            <w:tcW w:type="dxa" w:w="1512"/>
+            <w:shd w:fill="F2F6F8"/>
+            <w:tcMar>
+              <w:top w:w="75" w:type="dxa"/>
+              <w:start w:w="75" w:type="dxa"/>
+              <w:bottom w:w="75" w:type="dxa"/>
+              <w:end w:w="75" w:type="dxa"/>
+            </w:tcMar>
+            <w:vAlign w:val="center"/>
+          </w:tcPr>
+          <w:p>
+            <w:pPr>
+              <w:spacing w:after="0"/>
+              <w:jc w:val="right"/>
+            </w:pPr>
+            <w:r>
+              <w:rPr>
+                <w:rFonts w:ascii="Arial" w:hAnsi="Arial" w:eastAsia="Arial"/>
+                <w:color w:val="24313B"/>
+                <w:sz w:val="14"/>
+              </w:rPr>
+              <w:t>551</w:t>
+            </w:r>
+          </w:p>
+        </w:tc>
+        <w:tc>
+          <w:tcPr>
+            <w:tcW w:type="dxa" w:w="1512"/>
+            <w:shd w:fill="F2F6F8"/>
+            <w:tcMar>
+              <w:top w:w="75" w:type="dxa"/>
+              <w:start w:w="75" w:type="dxa"/>
+              <w:bottom w:w="75" w:type="dxa"/>
+              <w:end w:w="75" w:type="dxa"/>
+            </w:tcMar>
+            <w:vAlign w:val="center"/>
+          </w:tcPr>
+          <w:p>
+            <w:pPr>
+              <w:spacing w:after="0"/>
+              <w:jc w:val="right"/>
+            </w:pPr>
+            <w:r>
+              <w:rPr>
+                <w:rFonts w:ascii="Arial" w:hAnsi="Arial" w:eastAsia="Arial"/>
+                <w:color w:val="24313B"/>
+                <w:sz w:val="14"/>
+              </w:rPr>
+              <w:t>2,823</w:t>
+            </w:r>
+          </w:p>
+        </w:tc>
+        <w:tc>
+          <w:tcPr>
+            <w:tcW w:type="dxa" w:w="1512"/>
+            <w:shd w:fill="F2F6F8"/>
+            <w:tcMar>
+              <w:top w:w="75" w:type="dxa"/>
+              <w:start w:w="75" w:type="dxa"/>
+              <w:bottom w:w="75" w:type="dxa"/>
+              <w:end w:w="75" w:type="dxa"/>
+            </w:tcMar>
+            <w:vAlign w:val="center"/>
+          </w:tcPr>
+          <w:p>
+            <w:pPr>
+              <w:spacing w:after="0"/>
+              <w:jc w:val="right"/>
+            </w:pPr>
+            <w:r>
+              <w:rPr>
+                <w:rFonts w:ascii="Arial" w:hAnsi="Arial" w:eastAsia="Arial"/>
+                <w:color w:val="24313B"/>
+                <w:sz w:val="14"/>
+              </w:rPr>
+              <w:t>5,200</w:t>
+            </w:r>
+          </w:p>
+        </w:tc>
+      </w:tr>
+      <w:tr>
+        <w:trPr>
+          <w:cantSplit/>
+        </w:trPr>
+        <w:tc>
+          <w:tcPr>
+            <w:tcW w:type="dxa" w:w="3240"/>
+            <w:tcMar>
+              <w:top w:w="75" w:type="dxa"/>
+              <w:start w:w="75" w:type="dxa"/>
+              <w:bottom w:w="75" w:type="dxa"/>
+              <w:end w:w="75" w:type="dxa"/>
+            </w:tcMar>
+            <w:vAlign w:val="center"/>
+          </w:tcPr>
+          <w:p>
+            <w:pPr>
+              <w:spacing w:after="0"/>
+              <w:jc w:val="left"/>
+            </w:pPr>
+            <w:r>
+              <w:rPr>
+                <w:rFonts w:ascii="Arial" w:hAnsi="Arial" w:eastAsia="Arial"/>
+                <w:color w:val="24313B"/>
+                <w:sz w:val="14"/>
+              </w:rPr>
+              <w:t>transactionsByAccountSecurity</w:t>
+            </w:r>
+          </w:p>
+        </w:tc>
+        <w:tc>
+          <w:tcPr>
+            <w:tcW w:type="dxa" w:w="1512"/>
+            <w:tcMar>
+              <w:top w:w="75" w:type="dxa"/>
+              <w:start w:w="75" w:type="dxa"/>
+              <w:bottom w:w="75" w:type="dxa"/>
+              <w:end w:w="75" w:type="dxa"/>
+            </w:tcMar>
+            <w:vAlign w:val="center"/>
+          </w:tcPr>
+          <w:p>
+            <w:pPr>
+              <w:spacing w:after="0"/>
+              <w:jc w:val="right"/>
+            </w:pPr>
+            <w:r>
+              <w:rPr>
+                <w:rFonts w:ascii="Arial" w:hAnsi="Arial" w:eastAsia="Arial"/>
+                <w:color w:val="24313B"/>
+                <w:sz w:val="14"/>
+              </w:rPr>
+              <w:t>23,191</w:t>
+            </w:r>
+          </w:p>
+        </w:tc>
+        <w:tc>
+          <w:tcPr>
+            <w:tcW w:type="dxa" w:w="1512"/>
+            <w:tcMar>
+              <w:top w:w="75" w:type="dxa"/>
+              <w:start w:w="75" w:type="dxa"/>
+              <w:bottom w:w="75" w:type="dxa"/>
+              <w:end w:w="75" w:type="dxa"/>
+            </w:tcMar>
+            <w:vAlign w:val="center"/>
+          </w:tcPr>
+          <w:p>
+            <w:pPr>
+              <w:spacing w:after="0"/>
+              <w:jc w:val="right"/>
+            </w:pPr>
+            <w:r>
+              <w:rPr>
+                <w:rFonts w:ascii="Arial" w:hAnsi="Arial" w:eastAsia="Arial"/>
+                <w:color w:val="24313B"/>
+                <w:sz w:val="14"/>
+              </w:rPr>
+              <w:t>651</w:t>
+            </w:r>
+          </w:p>
+        </w:tc>
+        <w:tc>
+          <w:tcPr>
+            <w:tcW w:type="dxa" w:w="1512"/>
+            <w:tcMar>
+              <w:top w:w="75" w:type="dxa"/>
+              <w:start w:w="75" w:type="dxa"/>
+              <w:bottom w:w="75" w:type="dxa"/>
+              <w:end w:w="75" w:type="dxa"/>
+            </w:tcMar>
+            <w:vAlign w:val="center"/>
+          </w:tcPr>
+          <w:p>
+            <w:pPr>
+              <w:spacing w:after="0"/>
+              <w:jc w:val="right"/>
+            </w:pPr>
+            <w:r>
+              <w:rPr>
+                <w:rFonts w:ascii="Arial" w:hAnsi="Arial" w:eastAsia="Arial"/>
+                <w:color w:val="24313B"/>
+                <w:sz w:val="14"/>
+              </w:rPr>
+              <w:t>2,227</w:t>
+            </w:r>
+          </w:p>
+        </w:tc>
+        <w:tc>
+          <w:tcPr>
+            <w:tcW w:type="dxa" w:w="1512"/>
+            <w:tcMar>
+              <w:top w:w="75" w:type="dxa"/>
+              <w:start w:w="75" w:type="dxa"/>
+              <w:bottom w:w="75" w:type="dxa"/>
+              <w:end w:w="75" w:type="dxa"/>
+            </w:tcMar>
+            <w:vAlign w:val="center"/>
+          </w:tcPr>
+          <w:p>
+            <w:pPr>
+              <w:spacing w:after="0"/>
+              <w:jc w:val="right"/>
+            </w:pPr>
+            <w:r>
+              <w:rPr>
+                <w:rFonts w:ascii="Arial" w:hAnsi="Arial" w:eastAsia="Arial"/>
+                <w:color w:val="24313B"/>
+                <w:sz w:val="14"/>
+              </w:rPr>
+              <w:t>4,759</w:t>
+            </w:r>
+          </w:p>
+        </w:tc>
+      </w:tr>
+      <w:tr>
+        <w:trPr>
+          <w:cantSplit/>
+        </w:trPr>
+        <w:tc>
+          <w:tcPr>
+            <w:tcW w:type="dxa" w:w="3240"/>
+            <w:shd w:fill="F2F6F8"/>
+            <w:tcMar>
+              <w:top w:w="75" w:type="dxa"/>
+              <w:start w:w="75" w:type="dxa"/>
+              <w:bottom w:w="75" w:type="dxa"/>
+              <w:end w:w="75" w:type="dxa"/>
+            </w:tcMar>
+            <w:vAlign w:val="center"/>
+          </w:tcPr>
+          <w:p>
+            <w:pPr>
+              <w:spacing w:after="0"/>
+              <w:jc w:val="left"/>
+            </w:pPr>
+            <w:r>
+              <w:rPr>
+                <w:rFonts w:ascii="Arial" w:hAnsi="Arial" w:eastAsia="Arial"/>
+                <w:color w:val="24313B"/>
+                <w:sz w:val="14"/>
+              </w:rPr>
+              <w:t>accountPortfolioJoin</w:t>
+            </w:r>
+          </w:p>
+        </w:tc>
+        <w:tc>
+          <w:tcPr>
+            <w:tcW w:type="dxa" w:w="1512"/>
+            <w:shd w:fill="F2F6F8"/>
+            <w:tcMar>
+              <w:top w:w="75" w:type="dxa"/>
+              <w:start w:w="75" w:type="dxa"/>
+              <w:bottom w:w="75" w:type="dxa"/>
+              <w:end w:w="75" w:type="dxa"/>
+            </w:tcMar>
+            <w:vAlign w:val="center"/>
+          </w:tcPr>
+          <w:p>
+            <w:pPr>
+              <w:spacing w:after="0"/>
+              <w:jc w:val="right"/>
+            </w:pPr>
+            <w:r>
+              <w:rPr>
+                <w:rFonts w:ascii="Arial" w:hAnsi="Arial" w:eastAsia="Arial"/>
+                <w:color w:val="24313B"/>
+                <w:sz w:val="14"/>
+              </w:rPr>
+              <w:t>146,950</w:t>
+            </w:r>
+          </w:p>
+        </w:tc>
+        <w:tc>
+          <w:tcPr>
+            <w:tcW w:type="dxa" w:w="1512"/>
+            <w:shd w:fill="F2F6F8"/>
+            <w:tcMar>
+              <w:top w:w="75" w:type="dxa"/>
+              <w:start w:w="75" w:type="dxa"/>
+              <w:bottom w:w="75" w:type="dxa"/>
+              <w:end w:w="75" w:type="dxa"/>
+            </w:tcMar>
+            <w:vAlign w:val="center"/>
+          </w:tcPr>
+          <w:p>
+            <w:pPr>
+              <w:spacing w:after="0"/>
+              <w:jc w:val="right"/>
+            </w:pPr>
+            <w:r>
+              <w:rPr>
+                <w:rFonts w:ascii="Arial" w:hAnsi="Arial" w:eastAsia="Arial"/>
+                <w:color w:val="24313B"/>
+                <w:sz w:val="14"/>
+              </w:rPr>
+              <w:t>65</w:t>
+            </w:r>
+          </w:p>
+        </w:tc>
+        <w:tc>
+          <w:tcPr>
+            <w:tcW w:type="dxa" w:w="1512"/>
+            <w:shd w:fill="F2F6F8"/>
+            <w:tcMar>
+              <w:top w:w="75" w:type="dxa"/>
+              <w:start w:w="75" w:type="dxa"/>
+              <w:bottom w:w="75" w:type="dxa"/>
+              <w:end w:w="75" w:type="dxa"/>
+            </w:tcMar>
+            <w:vAlign w:val="center"/>
+          </w:tcPr>
+          <w:p>
+            <w:pPr>
+              <w:spacing w:after="0"/>
+              <w:jc w:val="right"/>
+            </w:pPr>
+            <w:r>
+              <w:rPr>
+                <w:rFonts w:ascii="Arial" w:hAnsi="Arial" w:eastAsia="Arial"/>
+                <w:color w:val="24313B"/>
+                <w:sz w:val="14"/>
+              </w:rPr>
+              <w:t>205</w:t>
+            </w:r>
+          </w:p>
+        </w:tc>
+        <w:tc>
+          <w:tcPr>
+            <w:tcW w:type="dxa" w:w="1512"/>
+            <w:shd w:fill="F2F6F8"/>
+            <w:tcMar>
+              <w:top w:w="75" w:type="dxa"/>
+              <w:start w:w="75" w:type="dxa"/>
+              <w:bottom w:w="75" w:type="dxa"/>
+              <w:end w:w="75" w:type="dxa"/>
+            </w:tcMar>
+            <w:vAlign w:val="center"/>
+          </w:tcPr>
+          <w:p>
+            <w:pPr>
+              <w:spacing w:after="0"/>
+              <w:jc w:val="right"/>
+            </w:pPr>
+            <w:r>
+              <w:rPr>
+                <w:rFonts w:ascii="Arial" w:hAnsi="Arial" w:eastAsia="Arial"/>
+                <w:color w:val="24313B"/>
+                <w:sz w:val="14"/>
+              </w:rPr>
+              <w:t>1,019</w:t>
+            </w:r>
+          </w:p>
+        </w:tc>
+      </w:tr>
+      <w:tr>
+        <w:trPr>
+          <w:cantSplit/>
+        </w:trPr>
+        <w:tc>
+          <w:tcPr>
+            <w:tcW w:type="dxa" w:w="3240"/>
+            <w:tcMar>
+              <w:top w:w="75" w:type="dxa"/>
+              <w:start w:w="75" w:type="dxa"/>
+              <w:bottom w:w="75" w:type="dxa"/>
+              <w:end w:w="75" w:type="dxa"/>
+            </w:tcMar>
+            <w:vAlign w:val="center"/>
+          </w:tcPr>
+          <w:p>
+            <w:pPr>
+              <w:spacing w:after="0"/>
+              <w:jc w:val="left"/>
+            </w:pPr>
+            <w:r>
+              <w:rPr>
+                <w:rFonts w:ascii="Arial" w:hAnsi="Arial" w:eastAsia="Arial"/>
+                <w:color w:val="24313B"/>
+                <w:sz w:val="14"/>
+              </w:rPr>
+              <w:t>accountActivityJoin</w:t>
+            </w:r>
+          </w:p>
+        </w:tc>
+        <w:tc>
+          <w:tcPr>
+            <w:tcW w:type="dxa" w:w="1512"/>
+            <w:tcMar>
+              <w:top w:w="75" w:type="dxa"/>
+              <w:start w:w="75" w:type="dxa"/>
+              <w:bottom w:w="75" w:type="dxa"/>
+              <w:end w:w="75" w:type="dxa"/>
+            </w:tcMar>
+            <w:vAlign w:val="center"/>
+          </w:tcPr>
+          <w:p>
+            <w:pPr>
+              <w:spacing w:after="0"/>
+              <w:jc w:val="right"/>
+            </w:pPr>
+            <w:r>
+              <w:rPr>
+                <w:rFonts w:ascii="Arial" w:hAnsi="Arial" w:eastAsia="Arial"/>
+                <w:color w:val="24313B"/>
+                <w:sz w:val="14"/>
+              </w:rPr>
+              <w:t>343,785</w:t>
+            </w:r>
+          </w:p>
+        </w:tc>
+        <w:tc>
+          <w:tcPr>
+            <w:tcW w:type="dxa" w:w="1512"/>
+            <w:tcMar>
+              <w:top w:w="75" w:type="dxa"/>
+              <w:start w:w="75" w:type="dxa"/>
+              <w:bottom w:w="75" w:type="dxa"/>
+              <w:end w:w="75" w:type="dxa"/>
+            </w:tcMar>
+            <w:vAlign w:val="center"/>
+          </w:tcPr>
+          <w:p>
+            <w:pPr>
+              <w:spacing w:after="0"/>
+              <w:jc w:val="right"/>
+            </w:pPr>
+            <w:r>
+              <w:rPr>
+                <w:rFonts w:ascii="Arial" w:hAnsi="Arial" w:eastAsia="Arial"/>
+                <w:color w:val="24313B"/>
+                <w:sz w:val="14"/>
+              </w:rPr>
+              <w:t>55</w:t>
+            </w:r>
+          </w:p>
+        </w:tc>
+        <w:tc>
+          <w:tcPr>
+            <w:tcW w:type="dxa" w:w="1512"/>
+            <w:tcMar>
+              <w:top w:w="75" w:type="dxa"/>
+              <w:start w:w="75" w:type="dxa"/>
+              <w:bottom w:w="75" w:type="dxa"/>
+              <w:end w:w="75" w:type="dxa"/>
+            </w:tcMar>
+            <w:vAlign w:val="center"/>
+          </w:tcPr>
+          <w:p>
+            <w:pPr>
+              <w:spacing w:after="0"/>
+              <w:jc w:val="right"/>
+            </w:pPr>
+            <w:r>
+              <w:rPr>
+                <w:rFonts w:ascii="Arial" w:hAnsi="Arial" w:eastAsia="Arial"/>
+                <w:color w:val="24313B"/>
+                <w:sz w:val="14"/>
+              </w:rPr>
+              <w:t>166</w:t>
+            </w:r>
+          </w:p>
+        </w:tc>
+        <w:tc>
+          <w:tcPr>
+            <w:tcW w:type="dxa" w:w="1512"/>
+            <w:tcMar>
+              <w:top w:w="75" w:type="dxa"/>
+              <w:start w:w="75" w:type="dxa"/>
+              <w:bottom w:w="75" w:type="dxa"/>
+              <w:end w:w="75" w:type="dxa"/>
+            </w:tcMar>
+            <w:vAlign w:val="center"/>
+          </w:tcPr>
+          <w:p>
+            <w:pPr>
+              <w:spacing w:after="0"/>
+              <w:jc w:val="right"/>
+            </w:pPr>
+            <w:r>
+              <w:rPr>
+                <w:rFonts w:ascii="Arial" w:hAnsi="Arial" w:eastAsia="Arial"/>
+                <w:color w:val="24313B"/>
+                <w:sz w:val="14"/>
+              </w:rPr>
+              <w:t>806</w:t>
+            </w:r>
+          </w:p>
+        </w:tc>
+      </w:tr>
+      <w:tr>
+        <w:trPr>
+          <w:cantSplit/>
+        </w:trPr>
+        <w:tc>
+          <w:tcPr>
+            <w:tcW w:type="dxa" w:w="3240"/>
+            <w:shd w:fill="F2F6F8"/>
+            <w:tcMar>
+              <w:top w:w="75" w:type="dxa"/>
+              <w:start w:w="75" w:type="dxa"/>
+              <w:bottom w:w="75" w:type="dxa"/>
+              <w:end w:w="75" w:type="dxa"/>
+            </w:tcMar>
+            <w:vAlign w:val="center"/>
+          </w:tcPr>
+          <w:p>
+            <w:pPr>
+              <w:spacing w:after="0"/>
+              <w:jc w:val="left"/>
+            </w:pPr>
+            <w:r>
+              <w:rPr>
+                <w:rFonts w:ascii="Arial" w:hAnsi="Arial" w:eastAsia="Arial"/>
+                <w:color w:val="24313B"/>
+                <w:sz w:val="14"/>
+              </w:rPr>
+              <w:t>accountSnapshot</w:t>
+            </w:r>
+          </w:p>
+        </w:tc>
+        <w:tc>
+          <w:tcPr>
+            <w:tcW w:type="dxa" w:w="1512"/>
+            <w:shd w:fill="F2F6F8"/>
+            <w:tcMar>
+              <w:top w:w="75" w:type="dxa"/>
+              <w:start w:w="75" w:type="dxa"/>
+              <w:bottom w:w="75" w:type="dxa"/>
+              <w:end w:w="75" w:type="dxa"/>
+            </w:tcMar>
+            <w:vAlign w:val="center"/>
+          </w:tcPr>
+          <w:p>
+            <w:pPr>
+              <w:spacing w:after="0"/>
+              <w:jc w:val="right"/>
+            </w:pPr>
+            <w:r>
+              <w:rPr>
+                <w:rFonts w:ascii="Arial" w:hAnsi="Arial" w:eastAsia="Arial"/>
+                <w:color w:val="24313B"/>
+                <w:sz w:val="14"/>
+              </w:rPr>
+              <w:t>17,862</w:t>
+            </w:r>
+          </w:p>
+        </w:tc>
+        <w:tc>
+          <w:tcPr>
+            <w:tcW w:type="dxa" w:w="1512"/>
+            <w:shd w:fill="F2F6F8"/>
+            <w:tcMar>
+              <w:top w:w="75" w:type="dxa"/>
+              <w:start w:w="75" w:type="dxa"/>
+              <w:bottom w:w="75" w:type="dxa"/>
+              <w:end w:w="75" w:type="dxa"/>
+            </w:tcMar>
+            <w:vAlign w:val="center"/>
+          </w:tcPr>
+          <w:p>
+            <w:pPr>
+              <w:spacing w:after="0"/>
+              <w:jc w:val="right"/>
+            </w:pPr>
+            <w:r>
+              <w:rPr>
+                <w:rFonts w:ascii="Arial" w:hAnsi="Arial" w:eastAsia="Arial"/>
+                <w:color w:val="24313B"/>
+                <w:sz w:val="14"/>
+              </w:rPr>
+              <w:t>209</w:t>
+            </w:r>
+          </w:p>
+        </w:tc>
+        <w:tc>
+          <w:tcPr>
+            <w:tcW w:type="dxa" w:w="1512"/>
+            <w:shd w:fill="F2F6F8"/>
+            <w:tcMar>
+              <w:top w:w="75" w:type="dxa"/>
+              <w:start w:w="75" w:type="dxa"/>
+              <w:bottom w:w="75" w:type="dxa"/>
+              <w:end w:w="75" w:type="dxa"/>
+            </w:tcMar>
+            <w:vAlign w:val="center"/>
+          </w:tcPr>
+          <w:p>
+            <w:pPr>
+              <w:spacing w:after="0"/>
+              <w:jc w:val="right"/>
+            </w:pPr>
+            <w:r>
+              <w:rPr>
+                <w:rFonts w:ascii="Arial" w:hAnsi="Arial" w:eastAsia="Arial"/>
+                <w:color w:val="24313B"/>
+                <w:sz w:val="14"/>
+              </w:rPr>
+              <w:t>302</w:t>
+            </w:r>
+          </w:p>
+        </w:tc>
+        <w:tc>
+          <w:tcPr>
+            <w:tcW w:type="dxa" w:w="1512"/>
+            <w:shd w:fill="F2F6F8"/>
+            <w:tcMar>
+              <w:top w:w="75" w:type="dxa"/>
+              <w:start w:w="75" w:type="dxa"/>
+              <w:bottom w:w="75" w:type="dxa"/>
+              <w:end w:w="75" w:type="dxa"/>
+            </w:tcMar>
+            <w:vAlign w:val="center"/>
+          </w:tcPr>
+          <w:p>
+            <w:pPr>
+              <w:spacing w:after="0"/>
+              <w:jc w:val="right"/>
+            </w:pPr>
+            <w:r>
+              <w:rPr>
+                <w:rFonts w:ascii="Arial" w:hAnsi="Arial" w:eastAsia="Arial"/>
+                <w:color w:val="24313B"/>
+                <w:sz w:val="14"/>
+              </w:rPr>
+              <w:t>979</w:t>
+            </w:r>
+          </w:p>
+        </w:tc>
+      </w:tr>
+    </w:tbl>
+    <w:p>
+      <w:pPr>
+        <w:spacing w:after="0"/>
+      </w:pPr>
+    </w:p>
+    <w:p>
+      <w:pPr>
+        <w:spacing w:after="80"/>
+      </w:pPr>
+      <w:r>
+        <w:rPr>
+          <w:rFonts w:ascii="Arial" w:hAnsi="Arial" w:eastAsia="Arial"/>
+          <w:b/>
+          <w:sz w:val="16"/>
+        </w:rPr>
+        <w:t xml:space="preserve">API and ALB telemetry. </w:t>
+      </w:r>
+      <w:r>
+        <w:rPr>
+          <w:rFonts w:ascii="Arial" w:hAnsi="Arial" w:eastAsia="Arial"/>
+          <w:sz w:val="16"/>
+        </w:rPr>
+        <w:t>All 128 workers returned samples and all configured Redis pools were ready with zero connection errors. Pool-average CPU was 49.62%–54.75% of one core, worst worker CPU p95 was 120.59%–124.43%, and every pool reached 100% event-loop p95. Worst socket-FD p95 ranged from 530 to 844. All 128 ALB targets remained healthy with zero unhealthy targets; the 4xx volume was application-generated HTTP 429 admission rejection.</w:t>
+      </w:r>
+    </w:p>
+    <w:p>
+      <w:pPr>
+        <w:spacing w:after="100"/>
+      </w:pPr>
+      <w:r>
+        <w:rPr>
+          <w:rFonts w:ascii="Arial" w:hAnsi="Arial" w:eastAsia="Arial"/>
+          <w:b/>
+          <w:sz w:val="16"/>
+        </w:rPr>
+        <w:t xml:space="preserve">Redis evidence and qualification. </w:t>
+      </w:r>
+      <w:r>
+        <w:rPr>
+          <w:rFonts w:ascii="Arial" w:hAnsi="Arial" w:eastAsia="Arial"/>
+          <w:sz w:val="16"/>
+        </w:rPr>
+        <w:t>Redis INFO ended at 11,648 clients, zero blocked clients, zero rejected connections, and 11,813 instantaneous ops/sec. Redis Cloud Prometheus timed out for all 9 load-window attempts because the private route was not yet active. After peering pcx-09f2038208de01def became active, a separate 15-of-15 validation observed 11,649 average connections, 10,848 average ops/sec, 283.66 GiB used of 2.5 TB, 100 shards, zero connection-limit exceedances, and database-up=1. Those Prometheus values are post-run connectivity evidence, not contemporaneous full-load measurements.</w:t>
       </w:r>
     </w:p>
     <w:p>
@@ -26654,7 +28819,7 @@
         <w:rPr>
           <w:rFonts w:ascii="Arial" w:hAnsi="Arial" w:eastAsia="Arial"/>
         </w:rPr>
-        <w:t>Live response data (191 bytes; newest full-load average 196.30 bytes)</w:t>
+        <w:t>Live response data (191 bytes; latest full-load average 196.27 bytes)</w:t>
       </w:r>
     </w:p>
     <w:tbl>
@@ -26867,7 +29032,7 @@
         <w:rPr>
           <w:rFonts w:ascii="Arial" w:hAnsi="Arial" w:eastAsia="Arial"/>
         </w:rPr>
-        <w:t>Abridged live response data (308 bytes exact; newest full-load average 332.63 bytes)</w:t>
+        <w:t>Abridged live response data (308 bytes exact; latest full-load average 332.58 bytes)</w:t>
       </w:r>
     </w:p>
     <w:tbl>
@@ -27086,7 +29251,7 @@
         <w:rPr>
           <w:rFonts w:ascii="Arial" w:hAnsi="Arial" w:eastAsia="Arial"/>
         </w:rPr>
-        <w:t>Abridged live response data (289,700 bytes exact; newest full-load average 294,023.99 bytes)</w:t>
+        <w:t>Abridged live response data (289,700 bytes exact; latest full-load average 294,029.49 bytes)</w:t>
       </w:r>
     </w:p>
     <w:tbl>
@@ -27342,7 +29507,7 @@
         <w:rPr>
           <w:rFonts w:ascii="Arial" w:hAnsi="Arial" w:eastAsia="Arial"/>
         </w:rPr>
-        <w:t>Abridged live response data (427,278 bytes exact; newest full-load average 430,898.05 bytes)</w:t>
+        <w:t>Abridged live response data (427,278 bytes exact; latest full-load average 430,910.02 bytes)</w:t>
       </w:r>
     </w:p>
     <w:tbl>
@@ -28681,7 +30846,7 @@
                 <w:color w:val="24313B"/>
                 <w:sz w:val="16"/>
               </w:rPr>
-              <w:t>Run valid full 180K + 30K stress</w:t>
+              <w:t>Run latest instrumented 180K + 30K stress</w:t>
             </w:r>
           </w:p>
         </w:tc>
@@ -28708,7 +30873,7 @@
                 <w:color w:val="24313B"/>
                 <w:sz w:val="16"/>
               </w:rPr>
-              <w:t>10,136.75 reads/s; 29,847.15 writes/s; complete per-pattern p50/p95/p99 and admission-failure counts recorded</w:t>
+              <w:t>11,767.22 reads/s; 29,001.74 writes/s; per-pattern HTTP and redis_ms percentiles recorded</w:t>
             </w:r>
           </w:p>
         </w:tc>
@@ -28740,7 +30905,7 @@
                 <w:color w:val="24313B"/>
                 <w:sz w:val="16"/>
               </w:rPr>
-              <w:t>P0</w:t>
+              <w:t>Done</w:t>
             </w:r>
           </w:p>
         </w:tc>
@@ -28767,7 +30932,7 @@
                 <w:color w:val="24313B"/>
                 <w:sz w:val="16"/>
               </w:rPr>
-              <w:t>Locate per-pool admission threshold</w:t>
+              <w:t>Capture API, ALB, and Redis connection telemetry</w:t>
             </w:r>
           </w:p>
         </w:tc>
@@ -28794,7 +30959,7 @@
                 <w:color w:val="24313B"/>
                 <w:sz w:val="16"/>
               </w:rPr>
-              <w:t>Step from 3.4K toward 15K; record first 429/drop/timeout plus sockets, connections, CPU, and ALB target metrics</w:t>
+              <w:t>128 workers sampled; 128 ALB targets healthy; Redis pools ready; 0 Redis connection errors</w:t>
             </w:r>
           </w:p>
         </w:tc>
@@ -28853,7 +31018,7 @@
                 <w:color w:val="24313B"/>
                 <w:sz w:val="16"/>
               </w:rPr>
-              <w:t>Optimize remaining indexed searches</w:t>
+              <w:t>Locate per-pool admission threshold</w:t>
             </w:r>
           </w:p>
         </w:tc>
@@ -28880,7 +31045,7 @@
                 <w:color w:val="24313B"/>
                 <w:sz w:val="16"/>
               </w:rPr>
-              <w:t>securityByNo, transactionsBySecurity, and account+security transactions ≤100 ms p95</w:t>
+              <w:t>Step each pool until first sustained 429, event-loop saturation, socket growth, or timeout</w:t>
             </w:r>
           </w:p>
         </w:tc>
@@ -28937,7 +31102,7 @@
                 <w:color w:val="24313B"/>
                 <w:sz w:val="16"/>
               </w:rPr>
-              <w:t>Measure compression CPU placement</w:t>
+              <w:t>Split point reads from indexed search</w:t>
             </w:r>
           </w:p>
         </w:tc>
@@ -28963,7 +31128,7 @@
                 <w:color w:val="24313B"/>
                 <w:sz w:val="16"/>
               </w:rPr>
-              <w:t>Record per-worker CPU/event loop; compare application versus proxy compression</w:t>
+              <w:t>Preserve light-read capacity while independently scaling and optimizing the three search paths</w:t>
             </w:r>
           </w:p>
         </w:tc>
@@ -28995,7 +31160,7 @@
                 <w:color w:val="24313B"/>
                 <w:sz w:val="16"/>
               </w:rPr>
-              <w:t>P1</w:t>
+              <w:t>P0</w:t>
             </w:r>
           </w:p>
         </w:tc>
@@ -29022,7 +31187,7 @@
                 <w:color w:val="24313B"/>
                 <w:sz w:val="16"/>
               </w:rPr>
-              <w:t>Recompute per-pool headroom</w:t>
+              <w:t>Reduce large-response API work</w:t>
             </w:r>
           </w:p>
         </w:tc>
@@ -29049,7 +31214,7 @@
                 <w:color w:val="24313B"/>
                 <w:sz w:val="16"/>
               </w:rPr>
-              <w:t>Repeat isolated and combined staircases before increasing offer</w:t>
+              <w:t>Test thin pass-through/pre-serialized projections, network-optimized instances, and proxy compression</w:t>
             </w:r>
           </w:p>
         </w:tc>
@@ -29106,7 +31271,7 @@
                 <w:color w:val="24313B"/>
                 <w:sz w:val="16"/>
               </w:rPr>
-              <w:t>Enable production durability</w:t>
+              <w:t>Rerun with private Redis metrics active</w:t>
             </w:r>
           </w:p>
         </w:tc>
@@ -29132,7 +31297,7 @@
                 <w:color w:val="24313B"/>
                 <w:sz w:val="16"/>
               </w:rPr>
-              <w:t>Replication + persistence + backups, then repeat capacity and restore tests</w:t>
+              <w:t>Warm-up-to-cooldown API, ALB, Redis Cloud, and network time series captured together</w:t>
             </w:r>
           </w:p>
         </w:tc>
@@ -29366,7 +31531,7 @@
                 <w:color w:val="24313B"/>
                 <w:sz w:val="18"/>
               </w:rPr>
-              <w:t>Keep Redis, the same-slot Function, the materialized account snapshot, pool-specific admission, and negotiated compression. The clean sequence proves 2,556 reads/sec within SLO and 3,400 reads/sec at rate; the newest full-load stress reaches 10,136.75 successful reads/sec while preserving 29,847.15 writes/sec, but with overwhelming admission failures. Invest next in per-pool admission/connection capacity, the three remaining indexed searches, and compression CPU placement.</w:t>
+              <w:t>Keep Redis, the same-slot Function, materialized account snapshots, pool-specific admission, and negotiated compression. The latest run raised overloaded reads to 11,767.22/sec while retaining 29,001.74 writes/sec, but 100% event-loop p95 and dominant HTTP 429/drop volume show that the tested API delivery tier remains the immediate ceiling. Redis connection pools were healthy with zero errors. Scale next by isolating point reads from searches and by reducing the application and network cost of the 137–431 KB response families; validate each change with contemporaneous private Redis Cloud metrics.</w:t>
             </w:r>
           </w:p>
         </w:tc>
@@ -31611,6 +33776,350 @@
           </w:p>
         </w:tc>
       </w:tr>
+      <w:tr>
+        <w:trPr>
+          <w:cantSplit/>
+        </w:trPr>
+        <w:tc>
+          <w:tcPr>
+            <w:tcW w:type="dxa" w:w="792"/>
+            <w:shd w:fill="F2F6F8"/>
+            <w:tcMar>
+              <w:top w:w="75" w:type="dxa"/>
+              <w:start w:w="75" w:type="dxa"/>
+              <w:bottom w:w="75" w:type="dxa"/>
+              <w:end w:w="75" w:type="dxa"/>
+            </w:tcMar>
+            <w:vAlign w:val="center"/>
+          </w:tcPr>
+          <w:p>
+            <w:pPr>
+              <w:spacing w:after="0"/>
+              <w:jc w:val="left"/>
+            </w:pPr>
+            <w:r>
+              <w:rPr>
+                <w:rFonts w:ascii="Arial" w:hAnsi="Arial" w:eastAsia="Arial"/>
+                <w:color w:val="24313B"/>
+                <w:sz w:val="14"/>
+              </w:rPr>
+              <w:t>[R15]</w:t>
+            </w:r>
+          </w:p>
+        </w:tc>
+        <w:tc>
+          <w:tcPr>
+            <w:tcW w:type="dxa" w:w="5832"/>
+            <w:shd w:fill="F2F6F8"/>
+            <w:tcMar>
+              <w:top w:w="75" w:type="dxa"/>
+              <w:start w:w="75" w:type="dxa"/>
+              <w:bottom w:w="75" w:type="dxa"/>
+              <w:end w:w="75" w:type="dxa"/>
+            </w:tcMar>
+            <w:vAlign w:val="center"/>
+          </w:tcPr>
+          <w:p>
+            <w:pPr>
+              <w:spacing w:after="0"/>
+              <w:jc w:val="left"/>
+            </w:pPr>
+            <w:r>
+              <w:rPr>
+                <w:rFonts w:ascii="Arial" w:hAnsi="Arial" w:eastAsia="Arial"/>
+                <w:color w:val="24313B"/>
+                <w:sz w:val="14"/>
+              </w:rPr>
+              <w:t>memtier-output/aws-load-runner/concurrent-18-hosts-full-load-20260723T185750Z/</w:t>
+            </w:r>
+          </w:p>
+        </w:tc>
+        <w:tc>
+          <w:tcPr>
+            <w:tcW w:type="dxa" w:w="3456"/>
+            <w:shd w:fill="F2F6F8"/>
+            <w:tcMar>
+              <w:top w:w="75" w:type="dxa"/>
+              <w:start w:w="75" w:type="dxa"/>
+              <w:bottom w:w="75" w:type="dxa"/>
+              <w:end w:w="75" w:type="dxa"/>
+            </w:tcMar>
+            <w:vAlign w:val="center"/>
+          </w:tcPr>
+          <w:p>
+            <w:pPr>
+              <w:spacing w:after="0"/>
+              <w:jc w:val="left"/>
+            </w:pPr>
+            <w:r>
+              <w:rPr>
+                <w:rFonts w:ascii="Arial" w:hAnsi="Arial" w:eastAsia="Arial"/>
+                <w:color w:val="24313B"/>
+                <w:sz w:val="14"/>
+              </w:rPr>
+              <w:t>latest per-pattern HTTP/redis_ms results, writes, Redis INFO before/after</w:t>
+            </w:r>
+          </w:p>
+        </w:tc>
+      </w:tr>
+      <w:tr>
+        <w:trPr>
+          <w:cantSplit/>
+        </w:trPr>
+        <w:tc>
+          <w:tcPr>
+            <w:tcW w:type="dxa" w:w="792"/>
+            <w:shd w:fill="F2F6F8"/>
+            <w:tcMar>
+              <w:top w:w="75" w:type="dxa"/>
+              <w:start w:w="75" w:type="dxa"/>
+              <w:bottom w:w="75" w:type="dxa"/>
+              <w:end w:w="75" w:type="dxa"/>
+            </w:tcMar>
+            <w:vAlign w:val="center"/>
+          </w:tcPr>
+          <w:p>
+            <w:pPr>
+              <w:spacing w:after="0"/>
+              <w:jc w:val="left"/>
+            </w:pPr>
+            <w:r>
+              <w:rPr>
+                <w:rFonts w:ascii="Arial" w:hAnsi="Arial" w:eastAsia="Arial"/>
+                <w:color w:val="24313B"/>
+                <w:sz w:val="14"/>
+              </w:rPr>
+              <w:t>[R16]</w:t>
+            </w:r>
+          </w:p>
+        </w:tc>
+        <w:tc>
+          <w:tcPr>
+            <w:tcW w:type="dxa" w:w="5832"/>
+            <w:shd w:fill="F2F6F8"/>
+            <w:tcMar>
+              <w:top w:w="75" w:type="dxa"/>
+              <w:start w:w="75" w:type="dxa"/>
+              <w:bottom w:w="75" w:type="dxa"/>
+              <w:end w:w="75" w:type="dxa"/>
+            </w:tcMar>
+            <w:vAlign w:val="center"/>
+          </w:tcPr>
+          <w:p>
+            <w:pPr>
+              <w:spacing w:after="0"/>
+              <w:jc w:val="left"/>
+            </w:pPr>
+            <w:r>
+              <w:rPr>
+                <w:rFonts w:ascii="Arial" w:hAnsi="Arial" w:eastAsia="Arial"/>
+                <w:color w:val="24313B"/>
+                <w:sz w:val="14"/>
+              </w:rPr>
+              <w:t>…/telemetry/api-runtime-summary.json; …/telemetry/alb-target-metrics.json</w:t>
+            </w:r>
+          </w:p>
+        </w:tc>
+        <w:tc>
+          <w:tcPr>
+            <w:tcW w:type="dxa" w:w="3456"/>
+            <w:shd w:fill="F2F6F8"/>
+            <w:tcMar>
+              <w:top w:w="75" w:type="dxa"/>
+              <w:start w:w="75" w:type="dxa"/>
+              <w:bottom w:w="75" w:type="dxa"/>
+              <w:end w:w="75" w:type="dxa"/>
+            </w:tcMar>
+            <w:vAlign w:val="center"/>
+          </w:tcPr>
+          <w:p>
+            <w:pPr>
+              <w:spacing w:after="0"/>
+              <w:jc w:val="left"/>
+            </w:pPr>
+            <w:r>
+              <w:rPr>
+                <w:rFonts w:ascii="Arial" w:hAnsi="Arial" w:eastAsia="Arial"/>
+                <w:color w:val="24313B"/>
+                <w:sz w:val="14"/>
+              </w:rPr>
+              <w:t>128 worker CPU/event loop/sockets/Redis pools and six ALB target groups</w:t>
+            </w:r>
+          </w:p>
+        </w:tc>
+      </w:tr>
+      <w:tr>
+        <w:trPr>
+          <w:cantSplit/>
+        </w:trPr>
+        <w:tc>
+          <w:tcPr>
+            <w:tcW w:type="dxa" w:w="792"/>
+            <w:shd w:fill="F2F6F8"/>
+            <w:tcMar>
+              <w:top w:w="75" w:type="dxa"/>
+              <w:start w:w="75" w:type="dxa"/>
+              <w:bottom w:w="75" w:type="dxa"/>
+              <w:end w:w="75" w:type="dxa"/>
+            </w:tcMar>
+            <w:vAlign w:val="center"/>
+          </w:tcPr>
+          <w:p>
+            <w:pPr>
+              <w:spacing w:after="0"/>
+              <w:jc w:val="left"/>
+            </w:pPr>
+            <w:r>
+              <w:rPr>
+                <w:rFonts w:ascii="Arial" w:hAnsi="Arial" w:eastAsia="Arial"/>
+                <w:color w:val="24313B"/>
+                <w:sz w:val="14"/>
+              </w:rPr>
+              <w:t>[R17]</w:t>
+            </w:r>
+          </w:p>
+        </w:tc>
+        <w:tc>
+          <w:tcPr>
+            <w:tcW w:type="dxa" w:w="5832"/>
+            <w:shd w:fill="F2F6F8"/>
+            <w:tcMar>
+              <w:top w:w="75" w:type="dxa"/>
+              <w:start w:w="75" w:type="dxa"/>
+              <w:bottom w:w="75" w:type="dxa"/>
+              <w:end w:w="75" w:type="dxa"/>
+            </w:tcMar>
+            <w:vAlign w:val="center"/>
+          </w:tcPr>
+          <w:p>
+            <w:pPr>
+              <w:spacing w:after="0"/>
+              <w:jc w:val="left"/>
+            </w:pPr>
+            <w:r>
+              <w:rPr>
+                <w:rFonts w:ascii="Arial" w:hAnsi="Arial" w:eastAsia="Arial"/>
+                <w:color w:val="24313B"/>
+                <w:sz w:val="14"/>
+              </w:rPr>
+              <w:t>…/telemetry/redis-cloud-metrics-summary.json</w:t>
+            </w:r>
+          </w:p>
+        </w:tc>
+        <w:tc>
+          <w:tcPr>
+            <w:tcW w:type="dxa" w:w="3456"/>
+            <w:shd w:fill="F2F6F8"/>
+            <w:tcMar>
+              <w:top w:w="75" w:type="dxa"/>
+              <w:start w:w="75" w:type="dxa"/>
+              <w:bottom w:w="75" w:type="dxa"/>
+              <w:end w:w="75" w:type="dxa"/>
+            </w:tcMar>
+            <w:vAlign w:val="center"/>
+          </w:tcPr>
+          <w:p>
+            <w:pPr>
+              <w:spacing w:after="0"/>
+              <w:jc w:val="left"/>
+            </w:pPr>
+            <w:r>
+              <w:rPr>
+                <w:rFonts w:ascii="Arial" w:hAnsi="Arial" w:eastAsia="Arial"/>
+                <w:color w:val="24313B"/>
+                <w:sz w:val="14"/>
+              </w:rPr>
+              <w:t>0/9 full-load Prometheus scrapes and private-route timeout evidence</w:t>
+            </w:r>
+          </w:p>
+        </w:tc>
+      </w:tr>
+      <w:tr>
+        <w:trPr>
+          <w:cantSplit/>
+        </w:trPr>
+        <w:tc>
+          <w:tcPr>
+            <w:tcW w:type="dxa" w:w="792"/>
+            <w:shd w:fill="F2F6F8"/>
+            <w:tcMar>
+              <w:top w:w="75" w:type="dxa"/>
+              <w:start w:w="75" w:type="dxa"/>
+              <w:bottom w:w="75" w:type="dxa"/>
+              <w:end w:w="75" w:type="dxa"/>
+            </w:tcMar>
+            <w:vAlign w:val="center"/>
+          </w:tcPr>
+          <w:p>
+            <w:pPr>
+              <w:spacing w:after="0"/>
+              <w:jc w:val="left"/>
+            </w:pPr>
+            <w:r>
+              <w:rPr>
+                <w:rFonts w:ascii="Arial" w:hAnsi="Arial" w:eastAsia="Arial"/>
+                <w:color w:val="24313B"/>
+                <w:sz w:val="14"/>
+              </w:rPr>
+              <w:t>[R18]</w:t>
+            </w:r>
+          </w:p>
+        </w:tc>
+        <w:tc>
+          <w:tcPr>
+            <w:tcW w:type="dxa" w:w="5832"/>
+            <w:shd w:fill="F2F6F8"/>
+            <w:tcMar>
+              <w:top w:w="75" w:type="dxa"/>
+              <w:start w:w="75" w:type="dxa"/>
+              <w:bottom w:w="75" w:type="dxa"/>
+              <w:end w:w="75" w:type="dxa"/>
+            </w:tcMar>
+            <w:vAlign w:val="center"/>
+          </w:tcPr>
+          <w:p>
+            <w:pPr>
+              <w:spacing w:after="0"/>
+              <w:jc w:val="left"/>
+            </w:pPr>
+            <w:r>
+              <w:rPr>
+                <w:rFonts w:ascii="Arial" w:hAnsi="Arial" w:eastAsia="Arial"/>
+                <w:color w:val="24313B"/>
+                <w:sz w:val="14"/>
+              </w:rPr>
+              <w:t>memtier-output/aws-load-runner/redis-cloud-peering-validation-20260723T193204Z/</w:t>
+            </w:r>
+          </w:p>
+        </w:tc>
+        <w:tc>
+          <w:tcPr>
+            <w:tcW w:type="dxa" w:w="3456"/>
+            <w:shd w:fill="F2F6F8"/>
+            <w:tcMar>
+              <w:top w:w="75" w:type="dxa"/>
+              <w:start w:w="75" w:type="dxa"/>
+              <w:bottom w:w="75" w:type="dxa"/>
+              <w:end w:w="75" w:type="dxa"/>
+            </w:tcMar>
+            <w:vAlign w:val="center"/>
+          </w:tcPr>
+          <w:p>
+            <w:pPr>
+              <w:spacing w:after="0"/>
+              <w:jc w:val="left"/>
+            </w:pPr>
+            <w:r>
+              <w:rPr>
+                <w:rFonts w:ascii="Arial" w:hAnsi="Arial" w:eastAsia="Arial"/>
+                <w:color w:val="24313B"/>
+                <w:sz w:val="14"/>
+              </w:rPr>
+              <w:t>15/15 post-run private Redis Cloud metrics validation</w:t>
+            </w:r>
+          </w:p>
+        </w:tc>
+      </w:tr>
     </w:tbl>
     <w:p>
       <w:pPr>
@@ -31624,7 +34133,7 @@
           <w:color w:val="61717D"/>
           <w:sz w:val="16"/>
         </w:rPr>
-        <w:t>Method note: all benchmark metrics in this report come from runner artifacts preserved in the local workspace. The four JSON examples were verified with read-only live queries before the earlier teardown. After the newest full-load run, the 146-instance AWS benchmark fleet and Redis Cloud database remain provisioned and billable; only the separate versioned S3 backup is intended as the reusable seed baseline.</w:t>
+        <w:t>Method note: all benchmark metrics in this report come from runner artifacts preserved in the local workspace. The four JSON examples were verified with read-only live queries before the earlier teardown. The latest full-load run captured API-worker, ALB, and Redis INFO telemetry; Redis Cloud Prometheus became reachable only after VPC peering was fixed, so its 15-of-15 validation sample is explicitly treated as post-run evidence. The 146-instance AWS benchmark fleet, Redis Cloud database, and retained S3 backup remain provisioned.</w:t>
       </w:r>
     </w:p>
     <w:sectPr>

</xml_diff>